<commit_message>
Update problem statement to past tense and tag sections for ownership
</commit_message>
<xml_diff>
--- a/report.docx
+++ b/report.docx
@@ -360,25 +360,7 @@
           <w:color w:val="000000" w:themeColor="text1"/>
           <w:lang w:val="en-US"/>
         </w:rPr>
-        <w:t xml:space="preserve">For the final project, we have decided to create a card game called Rummy. We picked this </w:t>
-      </w:r>
-      <w:proofErr w:type="gramStart"/>
-      <w:r>
-        <w:rPr>
-          <w:rFonts w:ascii="Times New Roman" w:eastAsia="Times New Roman" w:hAnsi="Times New Roman" w:cs="Times New Roman"/>
-          <w:color w:val="000000" w:themeColor="text1"/>
-          <w:lang w:val="en-US"/>
-        </w:rPr>
-        <w:t>particular card</w:t>
-      </w:r>
-      <w:proofErr w:type="gramEnd"/>
-      <w:r>
-        <w:rPr>
-          <w:rFonts w:ascii="Times New Roman" w:eastAsia="Times New Roman" w:hAnsi="Times New Roman" w:cs="Times New Roman"/>
-          <w:color w:val="000000" w:themeColor="text1"/>
-          <w:lang w:val="en-US"/>
-        </w:rPr>
-        <w:t xml:space="preserve"> game because it is not too simple or complex; it suits our programming level. It is also a perfect game to play against a computer, allowing the two of us to code different </w:t>
+        <w:t xml:space="preserve">For the final project, we have decided to create a card game called Rummy. We picked this particular card game because it is not too simple or complex; it suits our programming level. It is also a perfect game to play against a computer, allowing the two of us to code different </w:t>
       </w:r>
       <w:r>
         <w:rPr>
@@ -492,48 +474,16 @@
           <w:rFonts w:ascii="Times New Roman" w:hAnsi="Times New Roman" w:cs="Times New Roman"/>
           <w:lang w:val="en-US"/>
         </w:rPr>
-        <w:t xml:space="preserve">For example, a run can consist of one </w:t>
-      </w:r>
-      <w:proofErr w:type="gramStart"/>
-      <w:r>
-        <w:rPr>
-          <w:rFonts w:ascii="Times New Roman" w:hAnsi="Times New Roman" w:cs="Times New Roman"/>
-          <w:lang w:val="en-US"/>
-        </w:rPr>
-        <w:t>six of</w:t>
-      </w:r>
-      <w:proofErr w:type="gramEnd"/>
-      <w:r>
-        <w:rPr>
-          <w:rFonts w:ascii="Times New Roman" w:hAnsi="Times New Roman" w:cs="Times New Roman"/>
-          <w:lang w:val="en-US"/>
-        </w:rPr>
-        <w:t xml:space="preserve"> hearts, one seven of spades, and one eight of clubs. Similarly, a set may consist of three sixes of different suits (examples: hearts, spades, and clubs).</w:t>
-      </w:r>
-    </w:p>
-    <w:p>
-      <w:r>
-        <w:rPr>
-          <w:rFonts w:ascii="Times New Roman" w:hAnsi="Times New Roman" w:cs="Times New Roman"/>
-          <w:lang w:val="en-US"/>
-        </w:rPr>
-        <w:t xml:space="preserve">You can also lay off cards in Rummy. Laying off is when a player puts down a card that matches the other player’s </w:t>
-      </w:r>
-      <w:proofErr w:type="gramStart"/>
-      <w:r>
-        <w:rPr>
-          <w:rFonts w:ascii="Times New Roman" w:hAnsi="Times New Roman" w:cs="Times New Roman"/>
-          <w:lang w:val="en-US"/>
-        </w:rPr>
-        <w:t>meld</w:t>
-      </w:r>
-      <w:proofErr w:type="gramEnd"/>
-      <w:r>
-        <w:rPr>
-          <w:rFonts w:ascii="Times New Roman" w:hAnsi="Times New Roman" w:cs="Times New Roman"/>
-          <w:lang w:val="en-US"/>
-        </w:rPr>
-        <w:t>. For example, if player 1 puts down a set of three eights, player 2 can put down another eight to add to the meld. This is another way for a player to get rid of their cards.</w:t>
+        <w:t>For example, a run can consist of one six of hearts, one seven of spades, and one eight of clubs. Similarly, a set may consist of three sixes of different suits (examples: hearts, spades, and clubs).</w:t>
+      </w:r>
+    </w:p>
+    <w:p>
+      <w:r>
+        <w:rPr>
+          <w:rFonts w:ascii="Times New Roman" w:hAnsi="Times New Roman" w:cs="Times New Roman"/>
+          <w:lang w:val="en-US"/>
+        </w:rPr>
+        <w:t>You can also lay off cards in Rummy. Laying off is when a player puts down a card that matches the other player’s meld. For example, if player 1 puts down a set of three eights, player 2 can put down another eight to add to the meld. This is another way for a player to get rid of their cards.</w:t>
       </w:r>
     </w:p>
     <w:p>
@@ -624,8 +574,21 @@
           <w:rFonts w:ascii="Times New Roman" w:hAnsi="Times New Roman" w:cs="Times New Roman"/>
           <w:lang w:val="en-US"/>
         </w:rPr>
-        <w:lastRenderedPageBreak/>
-        <w:t xml:space="preserve">Our goal is to simulate a rummy game between the player and the computer. </w:t>
+        <w:t xml:space="preserve">Our goal </w:t>
+      </w:r>
+      <w:r>
+        <w:rPr>
+          <w:rFonts w:ascii="Times New Roman" w:hAnsi="Times New Roman" w:cs="Times New Roman"/>
+          <w:lang w:val="en-US"/>
+        </w:rPr>
+        <w:t>wa</w:t>
+      </w:r>
+      <w:r>
+        <w:rPr>
+          <w:rFonts w:ascii="Times New Roman" w:hAnsi="Times New Roman" w:cs="Times New Roman"/>
+          <w:lang w:val="en-US"/>
+        </w:rPr>
+        <w:t xml:space="preserve">s to simulate a rummy game between the player and the computer. </w:t>
       </w:r>
     </w:p>
     <w:p>
@@ -671,48 +634,30 @@
         </w:rPr>
         <w:t>Solution Strategy and Implementation</w:t>
       </w:r>
-    </w:p>
-    <w:p>
-      <w:pPr>
-        <w:rPr>
-          <w:rFonts w:ascii="Times New Roman" w:hAnsi="Times New Roman" w:cs="Times New Roman"/>
-          <w:lang w:val="en-US"/>
-        </w:rPr>
-      </w:pPr>
-      <w:r>
-        <w:rPr>
-          <w:rFonts w:ascii="Times New Roman" w:hAnsi="Times New Roman" w:cs="Times New Roman"/>
-          <w:lang w:val="en-US"/>
-        </w:rPr>
-        <w:t xml:space="preserve">We </w:t>
-      </w:r>
-      <w:r>
-        <w:rPr>
-          <w:rFonts w:ascii="Times New Roman" w:hAnsi="Times New Roman" w:cs="Times New Roman"/>
-          <w:lang w:val="en-US"/>
-        </w:rPr>
-        <w:t>made</w:t>
-      </w:r>
-      <w:r>
-        <w:rPr>
-          <w:rFonts w:ascii="Times New Roman" w:hAnsi="Times New Roman" w:cs="Times New Roman"/>
-          <w:lang w:val="en-US"/>
-        </w:rPr>
-        <w:t xml:space="preserve"> our online Rummy card game by dividing the development tasks effectively between the two programmers, Ruhani and Celeste. The game </w:t>
-      </w:r>
-      <w:r>
-        <w:rPr>
-          <w:rFonts w:ascii="Times New Roman" w:hAnsi="Times New Roman" w:cs="Times New Roman"/>
-          <w:lang w:val="en-US"/>
-        </w:rPr>
-        <w:t>followed the</w:t>
-      </w:r>
-      <w:r>
-        <w:rPr>
-          <w:rFonts w:ascii="Times New Roman" w:hAnsi="Times New Roman" w:cs="Times New Roman"/>
-          <w:lang w:val="en-US"/>
-        </w:rPr>
-        <w:t xml:space="preserve"> rules outlined in the Background section, with both the player and computer taking turns to play. We plan to implement our ideas one step at a time. Here are some of our key components:</w:t>
+      <w:r>
+        <w:rPr>
+          <w:rFonts w:ascii="Times New Roman" w:hAnsi="Times New Roman" w:cs="Times New Roman"/>
+          <w:b/>
+          <w:bCs/>
+          <w:sz w:val="28"/>
+          <w:szCs w:val="28"/>
+        </w:rPr>
+        <w:t xml:space="preserve"> - C</w:t>
+      </w:r>
+    </w:p>
+    <w:p>
+      <w:pPr>
+        <w:rPr>
+          <w:rFonts w:ascii="Times New Roman" w:hAnsi="Times New Roman" w:cs="Times New Roman"/>
+          <w:lang w:val="en-US"/>
+        </w:rPr>
+      </w:pPr>
+      <w:r>
+        <w:rPr>
+          <w:rFonts w:ascii="Times New Roman" w:hAnsi="Times New Roman" w:cs="Times New Roman"/>
+          <w:lang w:val="en-US"/>
+        </w:rPr>
+        <w:t>We made our online Rummy card game by dividing the development tasks effectively between the two programmers, Ruhani and Celeste. The game followed the rules outlined in the Background section, with both the player and computer taking turns to play. We plan to implement our ideas one step at a time. Here are some of our key components:</w:t>
       </w:r>
     </w:p>
     <w:p>
@@ -741,6 +686,15 @@
           <w:lang w:val="en-US"/>
         </w:rPr>
         <w:t>User Interface</w:t>
+      </w:r>
+      <w:r>
+        <w:rPr>
+          <w:rFonts w:ascii="Times New Roman" w:hAnsi="Times New Roman" w:cs="Times New Roman"/>
+          <w:b/>
+          <w:bCs/>
+          <w:lang w:val="en-US"/>
+        </w:rPr>
+        <w:t xml:space="preserve"> + Setup</w:t>
       </w:r>
     </w:p>
     <w:p>
@@ -956,21 +910,12 @@
           <w:lang w:val="en-US"/>
         </w:rPr>
       </w:pPr>
-      <w:proofErr w:type="gramStart"/>
-      <w:r>
-        <w:rPr>
-          <w:rFonts w:ascii="Times New Roman" w:hAnsi="Times New Roman" w:cs="Times New Roman"/>
-          <w:lang w:val="en-US"/>
-        </w:rPr>
-        <w:t>these</w:t>
-      </w:r>
-      <w:proofErr w:type="gramEnd"/>
-      <w:r>
-        <w:rPr>
-          <w:rFonts w:ascii="Times New Roman" w:hAnsi="Times New Roman" w:cs="Times New Roman"/>
-          <w:lang w:val="en-US"/>
-        </w:rPr>
-        <w:t xml:space="preserve"> are the main components of what we did ^</w:t>
+      <w:r>
+        <w:rPr>
+          <w:rFonts w:ascii="Times New Roman" w:hAnsi="Times New Roman" w:cs="Times New Roman"/>
+          <w:lang w:val="en-US"/>
+        </w:rPr>
+        <w:t>these are the main components of what we did ^</w:t>
       </w:r>
     </w:p>
     <w:p>
@@ -1015,6 +960,16 @@
           <w:szCs w:val="28"/>
         </w:rPr>
         <w:t>Experimental Framework</w:t>
+      </w:r>
+      <w:r>
+        <w:rPr>
+          <w:rFonts w:ascii="Times New Roman" w:hAnsi="Times New Roman" w:cs="Times New Roman"/>
+          <w:b/>
+          <w:bCs/>
+          <w:sz w:val="28"/>
+          <w:szCs w:val="28"/>
+        </w:rPr>
+        <w:t xml:space="preserve"> - R</w:t>
       </w:r>
     </w:p>
     <w:p>
@@ -1305,7 +1260,6 @@
               <w:rPr>
                 <w:rFonts w:ascii="Times New Roman" w:hAnsi="Times New Roman" w:cs="Times New Roman"/>
               </w:rPr>
-              <w:lastRenderedPageBreak/>
               <w:t>Made the welcome output and instructions for the player</w:t>
             </w:r>
           </w:p>
@@ -1877,13 +1831,7 @@
               <w:rPr>
                 <w:rFonts w:ascii="Times New Roman" w:hAnsi="Times New Roman" w:cs="Times New Roman"/>
               </w:rPr>
-              <w:t xml:space="preserve">Meld Detection – </w:t>
-            </w:r>
-            <w:r>
-              <w:rPr>
-                <w:rFonts w:ascii="Times New Roman" w:hAnsi="Times New Roman" w:cs="Times New Roman"/>
-              </w:rPr>
-              <w:t>runs</w:t>
+              <w:t>Meld Detection – runs</w:t>
             </w:r>
           </w:p>
         </w:tc>
@@ -1923,14 +1871,7 @@
                 <w:rFonts w:ascii="Times New Roman" w:hAnsi="Times New Roman" w:cs="Times New Roman"/>
                 <w:lang w:val="en-US"/>
               </w:rPr>
-              <w:t xml:space="preserve">February </w:t>
-            </w:r>
-            <w:r>
-              <w:rPr>
-                <w:rFonts w:ascii="Times New Roman" w:hAnsi="Times New Roman" w:cs="Times New Roman"/>
-                <w:lang w:val="en-US"/>
-              </w:rPr>
-              <w:t>20</w:t>
+              <w:t>February 20</w:t>
             </w:r>
           </w:p>
         </w:tc>
@@ -2548,6 +2489,16 @@
         </w:rPr>
         <w:t>Conclusions and Future Work</w:t>
       </w:r>
+      <w:r>
+        <w:rPr>
+          <w:rFonts w:ascii="Times New Roman" w:hAnsi="Times New Roman" w:cs="Times New Roman"/>
+          <w:b/>
+          <w:bCs/>
+          <w:sz w:val="28"/>
+          <w:szCs w:val="28"/>
+        </w:rPr>
+        <w:t xml:space="preserve"> - R</w:t>
+      </w:r>
     </w:p>
     <w:p>
       <w:pPr>
@@ -2566,7 +2517,6 @@
           <w:sz w:val="28"/>
           <w:szCs w:val="28"/>
         </w:rPr>
-        <w:lastRenderedPageBreak/>
         <w:t xml:space="preserve">Options for our future work </w:t>
       </w:r>
       <w:r>
@@ -2664,29 +2614,7 @@
           <w:sz w:val="28"/>
           <w:szCs w:val="28"/>
         </w:rPr>
-        <w:t>External Materials (</w:t>
-      </w:r>
-      <w:proofErr w:type="gramStart"/>
-      <w:r>
-        <w:rPr>
-          <w:rFonts w:ascii="Times New Roman" w:hAnsi="Times New Roman" w:cs="Times New Roman"/>
-          <w:b/>
-          <w:bCs/>
-          <w:sz w:val="28"/>
-          <w:szCs w:val="28"/>
-        </w:rPr>
-        <w:t>optional;</w:t>
-      </w:r>
-      <w:proofErr w:type="gramEnd"/>
-      <w:r>
-        <w:rPr>
-          <w:rFonts w:ascii="Times New Roman" w:hAnsi="Times New Roman" w:cs="Times New Roman"/>
-          <w:b/>
-          <w:bCs/>
-          <w:sz w:val="28"/>
-          <w:szCs w:val="28"/>
-        </w:rPr>
-        <w:t xml:space="preserve"> if you use any)</w:t>
+        <w:t>External Materials (optional; if you use any)</w:t>
       </w:r>
     </w:p>
     <w:p>
@@ -2768,7 +2696,19 @@
         <w:rPr>
           <w:rFonts w:ascii="Times New Roman" w:hAnsi="Times New Roman" w:cs="Times New Roman"/>
         </w:rPr>
-        <w:t xml:space="preserve"> Visual Studio Code, PyCharm, </w:t>
+        <w:t xml:space="preserve"> </w:t>
+      </w:r>
+      <w:r>
+        <w:rPr>
+          <w:rFonts w:ascii="Times New Roman" w:hAnsi="Times New Roman" w:cs="Times New Roman"/>
+        </w:rPr>
+        <w:t>*what did celeste use?*</w:t>
+      </w:r>
+      <w:r>
+        <w:rPr>
+          <w:rFonts w:ascii="Times New Roman" w:hAnsi="Times New Roman" w:cs="Times New Roman"/>
+        </w:rPr>
+        <w:t xml:space="preserve"> </w:t>
       </w:r>
       <w:r>
         <w:rPr>
@@ -2990,6 +2930,61 @@
           <w:lang w:val="en-US"/>
         </w:rPr>
         <w:t xml:space="preserve"> as our current knowledge may not be sufficient for this project.</w:t>
+      </w:r>
+    </w:p>
+    <w:p>
+      <w:pPr>
+        <w:pStyle w:val="ListParagraph"/>
+        <w:numPr>
+          <w:ilvl w:val="0"/>
+          <w:numId w:val="8"/>
+        </w:numPr>
+        <w:rPr>
+          <w:rFonts w:ascii="Times New Roman" w:hAnsi="Times New Roman" w:cs="Times New Roman"/>
+          <w:lang w:val="en-US"/>
+        </w:rPr>
+      </w:pPr>
+      <w:r>
+        <w:rPr>
+          <w:rFonts w:ascii="Times New Roman" w:hAnsi="Times New Roman" w:cs="Times New Roman"/>
+          <w:lang w:val="en-US"/>
+        </w:rPr>
+        <w:t>Sites like w3schools.com</w:t>
+      </w:r>
+      <w:r>
+        <w:rPr>
+          <w:rFonts w:ascii="Times New Roman" w:hAnsi="Times New Roman" w:cs="Times New Roman"/>
+          <w:lang w:val="en-US"/>
+        </w:rPr>
+        <w:t xml:space="preserve"> </w:t>
+      </w:r>
+      <w:r>
+        <w:rPr>
+          <w:rFonts w:ascii="Times New Roman" w:hAnsi="Times New Roman" w:cs="Times New Roman"/>
+          <w:lang w:val="en-US"/>
+        </w:rPr>
+        <w:t>and GeeksforGeeks</w:t>
+      </w:r>
+      <w:r>
+        <w:rPr>
+          <w:rFonts w:ascii="Times New Roman" w:hAnsi="Times New Roman" w:cs="Times New Roman"/>
+          <w:lang w:val="en-US"/>
+        </w:rPr>
+        <w:t>.org</w:t>
+      </w:r>
+      <w:r>
+        <w:rPr>
+          <w:rFonts w:ascii="Times New Roman" w:hAnsi="Times New Roman" w:cs="Times New Roman"/>
+          <w:lang w:val="en-US"/>
+        </w:rPr>
+        <w:t xml:space="preserve"> to learn about different Python functions</w:t>
+      </w:r>
+      <w:r>
+        <w:rPr>
+          <w:rFonts w:ascii="Times New Roman" w:hAnsi="Times New Roman" w:cs="Times New Roman"/>
+          <w:lang w:val="en-US"/>
+        </w:rPr>
+        <w:t xml:space="preserve"> and data structures.</w:t>
       </w:r>
     </w:p>
     <w:p>
@@ -4875,6 +4870,7 @@
   <w:style w:type="character" w:default="1" w:styleId="DefaultParagraphFont">
     <w:name w:val="Default Paragraph Font"/>
     <w:uiPriority w:val="1"/>
+    <w:semiHidden/>
     <w:unhideWhenUsed/>
   </w:style>
   <w:style w:type="table" w:default="1" w:styleId="TableNormal">

</xml_diff>

<commit_message>
Write out experimental framework section in full prose
</commit_message>
<xml_diff>
--- a/report.docx
+++ b/report.docx
@@ -294,7 +294,6 @@
     </w:p>
     <w:p>
       <w:pPr>
-        <w:jc w:val="center"/>
         <w:rPr>
           <w:rFonts w:ascii="Times New Roman" w:hAnsi="Times New Roman" w:cs="Times New Roman"/>
           <w:sz w:val="32"/>
@@ -360,7 +359,25 @@
           <w:color w:val="000000" w:themeColor="text1"/>
           <w:lang w:val="en-US"/>
         </w:rPr>
-        <w:t xml:space="preserve">For the final project, we have decided to create a card game called Rummy. We picked this particular card game because it is not too simple or complex; it suits our programming level. It is also a perfect game to play against a computer, allowing the two of us to code different </w:t>
+        <w:t xml:space="preserve">For the final project, we have decided to create a card game called Rummy. We picked this </w:t>
+      </w:r>
+      <w:proofErr w:type="gramStart"/>
+      <w:r>
+        <w:rPr>
+          <w:rFonts w:ascii="Times New Roman" w:eastAsia="Times New Roman" w:hAnsi="Times New Roman" w:cs="Times New Roman"/>
+          <w:color w:val="000000" w:themeColor="text1"/>
+          <w:lang w:val="en-US"/>
+        </w:rPr>
+        <w:t>particular card</w:t>
+      </w:r>
+      <w:proofErr w:type="gramEnd"/>
+      <w:r>
+        <w:rPr>
+          <w:rFonts w:ascii="Times New Roman" w:eastAsia="Times New Roman" w:hAnsi="Times New Roman" w:cs="Times New Roman"/>
+          <w:color w:val="000000" w:themeColor="text1"/>
+          <w:lang w:val="en-US"/>
+        </w:rPr>
+        <w:t xml:space="preserve"> game because it is not too simple or complex; it suits our programming level. It is also a perfect game to play against a computer, allowing the two of us to code different </w:t>
       </w:r>
       <w:r>
         <w:rPr>
@@ -474,16 +491,48 @@
           <w:rFonts w:ascii="Times New Roman" w:hAnsi="Times New Roman" w:cs="Times New Roman"/>
           <w:lang w:val="en-US"/>
         </w:rPr>
-        <w:t>For example, a run can consist of one six of hearts, one seven of spades, and one eight of clubs. Similarly, a set may consist of three sixes of different suits (examples: hearts, spades, and clubs).</w:t>
-      </w:r>
-    </w:p>
-    <w:p>
-      <w:r>
-        <w:rPr>
-          <w:rFonts w:ascii="Times New Roman" w:hAnsi="Times New Roman" w:cs="Times New Roman"/>
-          <w:lang w:val="en-US"/>
-        </w:rPr>
-        <w:t>You can also lay off cards in Rummy. Laying off is when a player puts down a card that matches the other player’s meld. For example, if player 1 puts down a set of three eights, player 2 can put down another eight to add to the meld. This is another way for a player to get rid of their cards.</w:t>
+        <w:t xml:space="preserve">For example, a run can consist of one </w:t>
+      </w:r>
+      <w:proofErr w:type="gramStart"/>
+      <w:r>
+        <w:rPr>
+          <w:rFonts w:ascii="Times New Roman" w:hAnsi="Times New Roman" w:cs="Times New Roman"/>
+          <w:lang w:val="en-US"/>
+        </w:rPr>
+        <w:t>six of</w:t>
+      </w:r>
+      <w:proofErr w:type="gramEnd"/>
+      <w:r>
+        <w:rPr>
+          <w:rFonts w:ascii="Times New Roman" w:hAnsi="Times New Roman" w:cs="Times New Roman"/>
+          <w:lang w:val="en-US"/>
+        </w:rPr>
+        <w:t xml:space="preserve"> hearts, one seven of spades, and one eight of clubs. Similarly, a set may consist of three sixes of different suits (examples: hearts, spades, and clubs).</w:t>
+      </w:r>
+    </w:p>
+    <w:p>
+      <w:r>
+        <w:rPr>
+          <w:rFonts w:ascii="Times New Roman" w:hAnsi="Times New Roman" w:cs="Times New Roman"/>
+          <w:lang w:val="en-US"/>
+        </w:rPr>
+        <w:t xml:space="preserve">You can also lay off cards in Rummy. Laying off is when a player puts down a card that matches the other player’s </w:t>
+      </w:r>
+      <w:proofErr w:type="gramStart"/>
+      <w:r>
+        <w:rPr>
+          <w:rFonts w:ascii="Times New Roman" w:hAnsi="Times New Roman" w:cs="Times New Roman"/>
+          <w:lang w:val="en-US"/>
+        </w:rPr>
+        <w:t>meld</w:t>
+      </w:r>
+      <w:proofErr w:type="gramEnd"/>
+      <w:r>
+        <w:rPr>
+          <w:rFonts w:ascii="Times New Roman" w:hAnsi="Times New Roman" w:cs="Times New Roman"/>
+          <w:lang w:val="en-US"/>
+        </w:rPr>
+        <w:t>. For example, if player 1 puts down a set of three eights, player 2 can put down another eight to add to the meld. This is another way for a player to get rid of their cards.</w:t>
       </w:r>
     </w:p>
     <w:p>
@@ -574,6 +623,7 @@
           <w:rFonts w:ascii="Times New Roman" w:hAnsi="Times New Roman" w:cs="Times New Roman"/>
           <w:lang w:val="en-US"/>
         </w:rPr>
+        <w:lastRenderedPageBreak/>
         <w:t xml:space="preserve">Our goal </w:t>
       </w:r>
       <w:r>
@@ -910,12 +960,21 @@
           <w:lang w:val="en-US"/>
         </w:rPr>
       </w:pPr>
-      <w:r>
-        <w:rPr>
-          <w:rFonts w:ascii="Times New Roman" w:hAnsi="Times New Roman" w:cs="Times New Roman"/>
-          <w:lang w:val="en-US"/>
-        </w:rPr>
-        <w:t>these are the main components of what we did ^</w:t>
+      <w:proofErr w:type="gramStart"/>
+      <w:r>
+        <w:rPr>
+          <w:rFonts w:ascii="Times New Roman" w:hAnsi="Times New Roman" w:cs="Times New Roman"/>
+          <w:lang w:val="en-US"/>
+        </w:rPr>
+        <w:t>these</w:t>
+      </w:r>
+      <w:proofErr w:type="gramEnd"/>
+      <w:r>
+        <w:rPr>
+          <w:rFonts w:ascii="Times New Roman" w:hAnsi="Times New Roman" w:cs="Times New Roman"/>
+          <w:lang w:val="en-US"/>
+        </w:rPr>
+        <w:t xml:space="preserve"> are the main components of what we did ^</w:t>
       </w:r>
     </w:p>
     <w:p>
@@ -976,81 +1035,428 @@
       <w:pPr>
         <w:rPr>
           <w:rFonts w:ascii="Times New Roman" w:hAnsi="Times New Roman" w:cs="Times New Roman"/>
-          <w:lang w:val="en-US"/>
-        </w:rPr>
-      </w:pPr>
-      <w:r>
-        <w:rPr>
-          <w:rFonts w:ascii="Times New Roman" w:hAnsi="Times New Roman" w:cs="Times New Roman"/>
-          <w:lang w:val="en-US"/>
-        </w:rPr>
-        <w:t xml:space="preserve">How did we approach </w:t>
-      </w:r>
-      <w:r>
-        <w:rPr>
-          <w:rFonts w:ascii="Times New Roman" w:hAnsi="Times New Roman" w:cs="Times New Roman"/>
-          <w:lang w:val="en-US"/>
-        </w:rPr>
-        <w:t>t</w:t>
-      </w:r>
-      <w:r>
-        <w:rPr>
-          <w:rFonts w:ascii="Times New Roman" w:hAnsi="Times New Roman" w:cs="Times New Roman"/>
-          <w:lang w:val="en-US"/>
-        </w:rPr>
-        <w:t>he problem</w:t>
-      </w:r>
-    </w:p>
-    <w:p>
-      <w:pPr>
-        <w:rPr>
-          <w:rFonts w:ascii="Times New Roman" w:hAnsi="Times New Roman" w:cs="Times New Roman"/>
-          <w:lang w:val="en-US"/>
-        </w:rPr>
-      </w:pPr>
-      <w:r>
-        <w:rPr>
-          <w:rFonts w:ascii="Times New Roman" w:hAnsi="Times New Roman" w:cs="Times New Roman"/>
-          <w:lang w:val="en-US"/>
-        </w:rPr>
-        <w:t xml:space="preserve">How did we </w:t>
-      </w:r>
-      <w:r>
-        <w:rPr>
-          <w:rFonts w:ascii="Times New Roman" w:hAnsi="Times New Roman" w:cs="Times New Roman"/>
-          <w:lang w:val="en-US"/>
-        </w:rPr>
-        <w:t>try to split up tasks vs how we ended up doing it</w:t>
-      </w:r>
-    </w:p>
-    <w:p>
-      <w:pPr>
-        <w:rPr>
-          <w:rFonts w:ascii="Times New Roman" w:hAnsi="Times New Roman" w:cs="Times New Roman"/>
-          <w:lang w:val="en-US"/>
-        </w:rPr>
-      </w:pPr>
-      <w:r>
-        <w:rPr>
-          <w:rFonts w:ascii="Times New Roman" w:hAnsi="Times New Roman" w:cs="Times New Roman"/>
-          <w:lang w:val="en-US"/>
-        </w:rPr>
-        <w:t xml:space="preserve">Ie. We planned to split computer and player functions but ended up splitting the actual individual functions. </w:t>
-      </w:r>
-    </w:p>
-    <w:p>
-      <w:pPr>
-        <w:rPr>
-          <w:rFonts w:ascii="Times New Roman" w:hAnsi="Times New Roman" w:cs="Times New Roman"/>
-          <w:lang w:val="en-US"/>
-        </w:rPr>
-      </w:pPr>
-      <w:r>
-        <w:rPr>
-          <w:rFonts w:ascii="Times New Roman" w:hAnsi="Times New Roman" w:cs="Times New Roman"/>
-          <w:lang w:val="en-US"/>
-        </w:rPr>
-        <w:t>Debugging took a lot of our time</w:t>
+        </w:rPr>
+      </w:pPr>
+      <w:r>
+        <w:rPr>
+          <w:rFonts w:ascii="Times New Roman" w:hAnsi="Times New Roman" w:cs="Times New Roman"/>
+        </w:rPr>
+        <w:t>Our approach to developing the Rummy card game involved a combination of structured planning and iterative development. Initially, we aimed to divide the project based on high-level components, with Celeste focusing on core gameplay logic (deck, dealing, drawing, melding) and Ruhani handling user interface, game flow, and scoring. However, as the project progressed, we found a more effective strategy was to divide tasks at a more granular, functional level.</w:t>
+      </w:r>
+    </w:p>
+    <w:p>
+      <w:pPr>
+        <w:rPr>
+          <w:rFonts w:ascii="Times New Roman" w:hAnsi="Times New Roman" w:cs="Times New Roman"/>
+        </w:rPr>
+      </w:pPr>
+      <w:r>
+        <w:rPr>
+          <w:rFonts w:ascii="Times New Roman" w:hAnsi="Times New Roman" w:cs="Times New Roman"/>
+          <w:b/>
+          <w:bCs/>
+        </w:rPr>
+        <w:t>Initial Planning vs. Actual Implementation:</w:t>
+      </w:r>
+    </w:p>
+    <w:p>
+      <w:pPr>
+        <w:numPr>
+          <w:ilvl w:val="0"/>
+          <w:numId w:val="10"/>
+        </w:numPr>
+        <w:rPr>
+          <w:rFonts w:ascii="Times New Roman" w:hAnsi="Times New Roman" w:cs="Times New Roman"/>
+        </w:rPr>
+      </w:pPr>
+      <w:r>
+        <w:rPr>
+          <w:rFonts w:ascii="Times New Roman" w:hAnsi="Times New Roman" w:cs="Times New Roman"/>
+          <w:b/>
+          <w:bCs/>
+        </w:rPr>
+        <w:t>Planned:</w:t>
+      </w:r>
+      <w:r>
+        <w:rPr>
+          <w:rFonts w:ascii="Times New Roman" w:hAnsi="Times New Roman" w:cs="Times New Roman"/>
+        </w:rPr>
+        <w:t xml:space="preserve"> </w:t>
+      </w:r>
+    </w:p>
+    <w:p>
+      <w:pPr>
+        <w:numPr>
+          <w:ilvl w:val="1"/>
+          <w:numId w:val="10"/>
+        </w:numPr>
+        <w:rPr>
+          <w:rFonts w:ascii="Times New Roman" w:hAnsi="Times New Roman" w:cs="Times New Roman"/>
+        </w:rPr>
+      </w:pPr>
+      <w:r>
+        <w:rPr>
+          <w:rFonts w:ascii="Times New Roman" w:hAnsi="Times New Roman" w:cs="Times New Roman"/>
+        </w:rPr>
+        <w:t>Celeste: Computer moves logic functions, card deck, draw/discard, meld detection.</w:t>
+      </w:r>
+    </w:p>
+    <w:p>
+      <w:pPr>
+        <w:numPr>
+          <w:ilvl w:val="1"/>
+          <w:numId w:val="10"/>
+        </w:numPr>
+        <w:rPr>
+          <w:rFonts w:ascii="Times New Roman" w:hAnsi="Times New Roman" w:cs="Times New Roman"/>
+        </w:rPr>
+      </w:pPr>
+      <w:r>
+        <w:rPr>
+          <w:rFonts w:ascii="Times New Roman" w:hAnsi="Times New Roman" w:cs="Times New Roman"/>
+        </w:rPr>
+        <w:t>Ruhani: User interface, player input, game flow, win detection, scoring.</w:t>
+      </w:r>
+    </w:p>
+    <w:p>
+      <w:pPr>
+        <w:numPr>
+          <w:ilvl w:val="0"/>
+          <w:numId w:val="10"/>
+        </w:numPr>
+        <w:rPr>
+          <w:rFonts w:ascii="Times New Roman" w:hAnsi="Times New Roman" w:cs="Times New Roman"/>
+        </w:rPr>
+      </w:pPr>
+      <w:r>
+        <w:rPr>
+          <w:rFonts w:ascii="Times New Roman" w:hAnsi="Times New Roman" w:cs="Times New Roman"/>
+          <w:b/>
+          <w:bCs/>
+        </w:rPr>
+        <w:lastRenderedPageBreak/>
+        <w:t>Actual:</w:t>
+      </w:r>
+      <w:r>
+        <w:rPr>
+          <w:rFonts w:ascii="Times New Roman" w:hAnsi="Times New Roman" w:cs="Times New Roman"/>
+        </w:rPr>
+        <w:t xml:space="preserve"> </w:t>
+      </w:r>
+    </w:p>
+    <w:p>
+      <w:pPr>
+        <w:numPr>
+          <w:ilvl w:val="1"/>
+          <w:numId w:val="10"/>
+        </w:numPr>
+        <w:rPr>
+          <w:rFonts w:ascii="Times New Roman" w:hAnsi="Times New Roman" w:cs="Times New Roman"/>
+        </w:rPr>
+      </w:pPr>
+      <w:r>
+        <w:rPr>
+          <w:rFonts w:ascii="Times New Roman" w:hAnsi="Times New Roman" w:cs="Times New Roman"/>
+        </w:rPr>
+        <w:t>We discovered that splitting the project into smaller, more manageable functions allowed for more parallel development and reduced merge conflicts. For example, within the meld detection, Celeste focused on the logic for sets and runs separately. Ruhani worked on functions for sorting, layoff, and then on the computer's layoff and discard logic.</w:t>
+      </w:r>
+      <w:r>
+        <w:rPr>
+          <w:rFonts w:ascii="Times New Roman" w:hAnsi="Times New Roman" w:cs="Times New Roman"/>
+        </w:rPr>
+        <w:t xml:space="preserve"> More details can be seen in our timeline.</w:t>
+      </w:r>
+    </w:p>
+    <w:p>
+      <w:pPr>
+        <w:numPr>
+          <w:ilvl w:val="1"/>
+          <w:numId w:val="10"/>
+        </w:numPr>
+        <w:rPr>
+          <w:rFonts w:ascii="Times New Roman" w:hAnsi="Times New Roman" w:cs="Times New Roman"/>
+        </w:rPr>
+      </w:pPr>
+      <w:r>
+        <w:rPr>
+          <w:rFonts w:ascii="Times New Roman" w:hAnsi="Times New Roman" w:cs="Times New Roman"/>
+        </w:rPr>
+        <w:t>This refined strategy allowed us to work more efficiently and address issues more quickly.</w:t>
+      </w:r>
+      <w:r>
+        <w:rPr>
+          <w:rFonts w:ascii="Times New Roman" w:hAnsi="Times New Roman" w:cs="Times New Roman"/>
+        </w:rPr>
+        <w:t xml:space="preserve"> </w:t>
+      </w:r>
+    </w:p>
+    <w:p>
+      <w:pPr>
+        <w:rPr>
+          <w:rFonts w:ascii="Times New Roman" w:hAnsi="Times New Roman" w:cs="Times New Roman"/>
+        </w:rPr>
+      </w:pPr>
+      <w:r>
+        <w:rPr>
+          <w:rFonts w:ascii="Times New Roman" w:hAnsi="Times New Roman" w:cs="Times New Roman"/>
+          <w:b/>
+          <w:bCs/>
+        </w:rPr>
+        <w:t>Development Process:</w:t>
+      </w:r>
+    </w:p>
+    <w:p>
+      <w:pPr>
+        <w:numPr>
+          <w:ilvl w:val="0"/>
+          <w:numId w:val="11"/>
+        </w:numPr>
+        <w:rPr>
+          <w:rFonts w:ascii="Times New Roman" w:hAnsi="Times New Roman" w:cs="Times New Roman"/>
+        </w:rPr>
+      </w:pPr>
+      <w:r>
+        <w:rPr>
+          <w:rFonts w:ascii="Times New Roman" w:hAnsi="Times New Roman" w:cs="Times New Roman"/>
+          <w:b/>
+          <w:bCs/>
+        </w:rPr>
+        <w:t>Iterative Development:</w:t>
+      </w:r>
+      <w:r>
+        <w:rPr>
+          <w:rFonts w:ascii="Times New Roman" w:hAnsi="Times New Roman" w:cs="Times New Roman"/>
+        </w:rPr>
+        <w:t xml:space="preserve"> We adopted an iterative development approach, focusing on implementing core functionalities first (deck creation, dealing, drawing) and then gradually adding more complex features (melding, computer AI, scoring).</w:t>
+      </w:r>
+    </w:p>
+    <w:p>
+      <w:pPr>
+        <w:numPr>
+          <w:ilvl w:val="0"/>
+          <w:numId w:val="11"/>
+        </w:numPr>
+        <w:rPr>
+          <w:rFonts w:ascii="Times New Roman" w:hAnsi="Times New Roman" w:cs="Times New Roman"/>
+        </w:rPr>
+      </w:pPr>
+      <w:r>
+        <w:rPr>
+          <w:rFonts w:ascii="Times New Roman" w:hAnsi="Times New Roman" w:cs="Times New Roman"/>
+          <w:b/>
+          <w:bCs/>
+        </w:rPr>
+        <w:t>Version Control:</w:t>
+      </w:r>
+      <w:r>
+        <w:rPr>
+          <w:rFonts w:ascii="Times New Roman" w:hAnsi="Times New Roman" w:cs="Times New Roman"/>
+        </w:rPr>
+        <w:t xml:space="preserve"> GitHub played a crucial role in our workflow, enabling us to track changes, manage versions, and collaborate effectively. We used branches for individual features and merged them into the main branch after thorough testing.</w:t>
+      </w:r>
+    </w:p>
+    <w:p>
+      <w:pPr>
+        <w:numPr>
+          <w:ilvl w:val="0"/>
+          <w:numId w:val="11"/>
+        </w:numPr>
+        <w:rPr>
+          <w:rFonts w:ascii="Times New Roman" w:hAnsi="Times New Roman" w:cs="Times New Roman"/>
+        </w:rPr>
+      </w:pPr>
+      <w:r>
+        <w:rPr>
+          <w:rFonts w:ascii="Times New Roman" w:hAnsi="Times New Roman" w:cs="Times New Roman"/>
+          <w:b/>
+          <w:bCs/>
+        </w:rPr>
+        <w:t>Debugging:</w:t>
+      </w:r>
+      <w:r>
+        <w:rPr>
+          <w:rFonts w:ascii="Times New Roman" w:hAnsi="Times New Roman" w:cs="Times New Roman"/>
+        </w:rPr>
+        <w:t xml:space="preserve"> Debugging consumed a significant portion of our development time. We encountered numerous challenges related to card manipulation, meld detection, and computer AI logic. We used print statements, debugging tools within Thonny, and thorough testing to identify and resolve these issues.</w:t>
+      </w:r>
+    </w:p>
+    <w:p>
+      <w:pPr>
+        <w:numPr>
+          <w:ilvl w:val="0"/>
+          <w:numId w:val="11"/>
+        </w:numPr>
+        <w:rPr>
+          <w:rFonts w:ascii="Times New Roman" w:hAnsi="Times New Roman" w:cs="Times New Roman"/>
+        </w:rPr>
+      </w:pPr>
+      <w:r>
+        <w:rPr>
+          <w:rFonts w:ascii="Times New Roman" w:hAnsi="Times New Roman" w:cs="Times New Roman"/>
+          <w:b/>
+          <w:bCs/>
+        </w:rPr>
+        <w:t>Testing:</w:t>
+      </w:r>
+      <w:r>
+        <w:rPr>
+          <w:rFonts w:ascii="Times New Roman" w:hAnsi="Times New Roman" w:cs="Times New Roman"/>
+        </w:rPr>
+        <w:t xml:space="preserve"> We conducted regular testing throughout the development process, ensuring that each feature functioned correctly before moving on to the next. We also performed user testing with peers to gather feedback and identify areas for improvement.</w:t>
+      </w:r>
+    </w:p>
+    <w:p>
+      <w:pPr>
+        <w:numPr>
+          <w:ilvl w:val="0"/>
+          <w:numId w:val="11"/>
+        </w:numPr>
+        <w:rPr>
+          <w:rFonts w:ascii="Times New Roman" w:hAnsi="Times New Roman" w:cs="Times New Roman"/>
+        </w:rPr>
+      </w:pPr>
+      <w:r>
+        <w:rPr>
+          <w:rFonts w:ascii="Times New Roman" w:hAnsi="Times New Roman" w:cs="Times New Roman"/>
+          <w:b/>
+          <w:bCs/>
+        </w:rPr>
+        <w:t>Task Management:</w:t>
+      </w:r>
+      <w:r>
+        <w:rPr>
+          <w:rFonts w:ascii="Times New Roman" w:hAnsi="Times New Roman" w:cs="Times New Roman"/>
+        </w:rPr>
+        <w:t xml:space="preserve"> We used Microsoft Outlook to communicate and track progress, ensuring that we stayed on schedule and addressed any roadblocks promptly.</w:t>
+      </w:r>
+    </w:p>
+    <w:p>
+      <w:pPr>
+        <w:rPr>
+          <w:rFonts w:ascii="Times New Roman" w:hAnsi="Times New Roman" w:cs="Times New Roman"/>
+        </w:rPr>
+      </w:pPr>
+      <w:r>
+        <w:rPr>
+          <w:rFonts w:ascii="Times New Roman" w:hAnsi="Times New Roman" w:cs="Times New Roman"/>
+          <w:b/>
+          <w:bCs/>
+        </w:rPr>
+        <w:t>Challenges and Lessons Learned:</w:t>
+      </w:r>
+    </w:p>
+    <w:p>
+      <w:pPr>
+        <w:numPr>
+          <w:ilvl w:val="0"/>
+          <w:numId w:val="12"/>
+        </w:numPr>
+        <w:rPr>
+          <w:rFonts w:ascii="Times New Roman" w:hAnsi="Times New Roman" w:cs="Times New Roman"/>
+        </w:rPr>
+      </w:pPr>
+      <w:r>
+        <w:rPr>
+          <w:rFonts w:ascii="Times New Roman" w:hAnsi="Times New Roman" w:cs="Times New Roman"/>
+          <w:b/>
+          <w:bCs/>
+        </w:rPr>
+        <w:t>Complexity of Meld Detection:</w:t>
+      </w:r>
+      <w:r>
+        <w:rPr>
+          <w:rFonts w:ascii="Times New Roman" w:hAnsi="Times New Roman" w:cs="Times New Roman"/>
+        </w:rPr>
+        <w:t xml:space="preserve"> Implementing the meld detection logic, especially for runs, proved to be more challenging than anticipated. We had to carefully consider various edge cases and ensure that the logic was robust and accurate.</w:t>
+      </w:r>
+    </w:p>
+    <w:p>
+      <w:pPr>
+        <w:numPr>
+          <w:ilvl w:val="0"/>
+          <w:numId w:val="12"/>
+        </w:numPr>
+        <w:rPr>
+          <w:rFonts w:ascii="Times New Roman" w:hAnsi="Times New Roman" w:cs="Times New Roman"/>
+        </w:rPr>
+      </w:pPr>
+      <w:r>
+        <w:rPr>
+          <w:rFonts w:ascii="Times New Roman" w:hAnsi="Times New Roman" w:cs="Times New Roman"/>
+          <w:b/>
+          <w:bCs/>
+        </w:rPr>
+        <w:t>Computer AI:</w:t>
+      </w:r>
+      <w:r>
+        <w:rPr>
+          <w:rFonts w:ascii="Times New Roman" w:hAnsi="Times New Roman" w:cs="Times New Roman"/>
+        </w:rPr>
+        <w:t xml:space="preserve"> Developing a simple but functional computer AI required careful planning and implementation. We had to balance the need for logical decision-making with the constraints of our development timeline.</w:t>
+      </w:r>
+    </w:p>
+    <w:p>
+      <w:pPr>
+        <w:numPr>
+          <w:ilvl w:val="0"/>
+          <w:numId w:val="12"/>
+        </w:numPr>
+        <w:rPr>
+          <w:rFonts w:ascii="Times New Roman" w:hAnsi="Times New Roman" w:cs="Times New Roman"/>
+        </w:rPr>
+      </w:pPr>
+      <w:r>
+        <w:rPr>
+          <w:rFonts w:ascii="Times New Roman" w:hAnsi="Times New Roman" w:cs="Times New Roman"/>
+          <w:b/>
+          <w:bCs/>
+        </w:rPr>
+        <w:t>Debugging Time:</w:t>
+      </w:r>
+      <w:r>
+        <w:rPr>
+          <w:rFonts w:ascii="Times New Roman" w:hAnsi="Times New Roman" w:cs="Times New Roman"/>
+        </w:rPr>
+        <w:t xml:space="preserve"> We underestimated the amount of time required for debugging. This highlighted the importance of thorough testing and careful planning.</w:t>
+      </w:r>
+    </w:p>
+    <w:p>
+      <w:pPr>
+        <w:numPr>
+          <w:ilvl w:val="0"/>
+          <w:numId w:val="12"/>
+        </w:numPr>
+        <w:rPr>
+          <w:rFonts w:ascii="Times New Roman" w:hAnsi="Times New Roman" w:cs="Times New Roman"/>
+        </w:rPr>
+      </w:pPr>
+      <w:r>
+        <w:rPr>
+          <w:rFonts w:ascii="Times New Roman" w:hAnsi="Times New Roman" w:cs="Times New Roman"/>
+          <w:b/>
+          <w:bCs/>
+        </w:rPr>
+        <w:lastRenderedPageBreak/>
+        <w:t>Collaboration:</w:t>
+      </w:r>
+      <w:r>
+        <w:rPr>
+          <w:rFonts w:ascii="Times New Roman" w:hAnsi="Times New Roman" w:cs="Times New Roman"/>
+        </w:rPr>
+        <w:t xml:space="preserve"> Working collaboratively on a complex project required effective communication and coordination. We learned the importance of clear communication, regular meetings, and a shared understanding of the project goals.</w:t>
+      </w:r>
+    </w:p>
+    <w:p>
+      <w:pPr>
+        <w:rPr>
+          <w:rFonts w:ascii="Times New Roman" w:hAnsi="Times New Roman" w:cs="Times New Roman"/>
+        </w:rPr>
+      </w:pPr>
+      <w:r>
+        <w:rPr>
+          <w:rFonts w:ascii="Times New Roman" w:hAnsi="Times New Roman" w:cs="Times New Roman"/>
+        </w:rPr>
+        <w:t>In summary, our experimental framework involved a flexible and iterative approach, adapting to the challenges we encountered and leveraging version control and collaboration tools to achieve our project goals.</w:t>
       </w:r>
     </w:p>
     <w:p>
@@ -2374,6 +2780,7 @@
           <w:b/>
           <w:bCs/>
         </w:rPr>
+        <w:lastRenderedPageBreak/>
         <w:t>Computer AI Performs Logical Actions</w:t>
       </w:r>
       <w:r>
@@ -2507,25 +2914,13 @@
         </w:tabs>
         <w:rPr>
           <w:rFonts w:ascii="Times New Roman" w:hAnsi="Times New Roman" w:cs="Times New Roman"/>
-          <w:sz w:val="28"/>
-          <w:szCs w:val="28"/>
-        </w:rPr>
-      </w:pPr>
-      <w:r>
-        <w:rPr>
-          <w:rFonts w:ascii="Times New Roman" w:hAnsi="Times New Roman" w:cs="Times New Roman"/>
-          <w:sz w:val="28"/>
-          <w:szCs w:val="28"/>
-        </w:rPr>
-        <w:t xml:space="preserve">Options for our future work </w:t>
-      </w:r>
-      <w:r>
-        <w:rPr>
-          <w:rFonts w:ascii="Times New Roman" w:hAnsi="Times New Roman" w:cs="Times New Roman"/>
-          <w:sz w:val="28"/>
-          <w:szCs w:val="28"/>
-        </w:rPr>
-        <w:t>are more card games</w:t>
+        </w:rPr>
+      </w:pPr>
+      <w:r>
+        <w:rPr>
+          <w:rFonts w:ascii="Times New Roman" w:hAnsi="Times New Roman" w:cs="Times New Roman"/>
+        </w:rPr>
+        <w:t>In this project, we successfully developed a functional Rummy card game, achieving our primary goal of simulating a player versus computer card game environment. This project allowed us to apply and expand our programming skills in Python, particularly in areas such as game logic, user interaction, and basic AI implementation.</w:t>
       </w:r>
     </w:p>
     <w:p>
@@ -2535,17 +2930,15 @@
         </w:tabs>
         <w:rPr>
           <w:rFonts w:ascii="Times New Roman" w:hAnsi="Times New Roman" w:cs="Times New Roman"/>
-          <w:sz w:val="28"/>
-          <w:szCs w:val="28"/>
-        </w:rPr>
-      </w:pPr>
-      <w:r>
-        <w:rPr>
-          <w:rFonts w:ascii="Times New Roman" w:hAnsi="Times New Roman" w:cs="Times New Roman"/>
-          <w:sz w:val="28"/>
-          <w:szCs w:val="28"/>
-        </w:rPr>
-        <w:t>We achieved a functioning rummy game</w:t>
+        </w:rPr>
+      </w:pPr>
+      <w:r>
+        <w:rPr>
+          <w:rFonts w:ascii="Times New Roman" w:hAnsi="Times New Roman" w:cs="Times New Roman"/>
+          <w:b/>
+          <w:bCs/>
+        </w:rPr>
+        <w:t>Achievement of Proposed Goals:</w:t>
       </w:r>
     </w:p>
     <w:p>
@@ -2555,25 +2948,392 @@
         </w:tabs>
         <w:rPr>
           <w:rFonts w:ascii="Times New Roman" w:hAnsi="Times New Roman" w:cs="Times New Roman"/>
-          <w:sz w:val="28"/>
-          <w:szCs w:val="28"/>
-        </w:rPr>
-      </w:pPr>
-      <w:r>
-        <w:rPr>
-          <w:rFonts w:ascii="Times New Roman" w:hAnsi="Times New Roman" w:cs="Times New Roman"/>
-          <w:sz w:val="28"/>
-          <w:szCs w:val="28"/>
-        </w:rPr>
-        <w:t xml:space="preserve">The introduction, what we wanted to achieve vs what we </w:t>
-      </w:r>
-      <w:r>
-        <w:rPr>
-          <w:rFonts w:ascii="Times New Roman" w:hAnsi="Times New Roman" w:cs="Times New Roman"/>
-          <w:sz w:val="28"/>
-          <w:szCs w:val="28"/>
-        </w:rPr>
-        <w:t>did achieve</w:t>
+        </w:rPr>
+      </w:pPr>
+      <w:r>
+        <w:rPr>
+          <w:rFonts w:ascii="Times New Roman" w:hAnsi="Times New Roman" w:cs="Times New Roman"/>
+        </w:rPr>
+        <w:t>As outlined in our proposal, our initial objective was to create a Rummy game that included:</w:t>
+      </w:r>
+    </w:p>
+    <w:p>
+      <w:pPr>
+        <w:numPr>
+          <w:ilvl w:val="0"/>
+          <w:numId w:val="13"/>
+        </w:numPr>
+        <w:rPr>
+          <w:rFonts w:ascii="Times New Roman" w:hAnsi="Times New Roman" w:cs="Times New Roman"/>
+        </w:rPr>
+      </w:pPr>
+      <w:r>
+        <w:rPr>
+          <w:rFonts w:ascii="Times New Roman" w:hAnsi="Times New Roman" w:cs="Times New Roman"/>
+          <w:b/>
+          <w:bCs/>
+        </w:rPr>
+        <w:t>Player vs. Computer Gameplay:</w:t>
+      </w:r>
+      <w:r>
+        <w:rPr>
+          <w:rFonts w:ascii="Times New Roman" w:hAnsi="Times New Roman" w:cs="Times New Roman"/>
+        </w:rPr>
+        <w:t xml:space="preserve"> We successfully implemented this, allowing users to play a full game against a computer opponent.</w:t>
+      </w:r>
+    </w:p>
+    <w:p>
+      <w:pPr>
+        <w:numPr>
+          <w:ilvl w:val="0"/>
+          <w:numId w:val="13"/>
+        </w:numPr>
+        <w:rPr>
+          <w:rFonts w:ascii="Times New Roman" w:hAnsi="Times New Roman" w:cs="Times New Roman"/>
+        </w:rPr>
+      </w:pPr>
+      <w:r>
+        <w:rPr>
+          <w:rFonts w:ascii="Times New Roman" w:hAnsi="Times New Roman" w:cs="Times New Roman"/>
+          <w:b/>
+          <w:bCs/>
+        </w:rPr>
+        <w:t>Computer AI:</w:t>
+      </w:r>
+      <w:r>
+        <w:rPr>
+          <w:rFonts w:ascii="Times New Roman" w:hAnsi="Times New Roman" w:cs="Times New Roman"/>
+        </w:rPr>
+        <w:t xml:space="preserve"> While not an expert-level AI, the computer player demonstrates logical decision-making in drawing, melding, and discarding cards.</w:t>
+      </w:r>
+    </w:p>
+    <w:p>
+      <w:pPr>
+        <w:numPr>
+          <w:ilvl w:val="0"/>
+          <w:numId w:val="13"/>
+        </w:numPr>
+        <w:rPr>
+          <w:rFonts w:ascii="Times New Roman" w:hAnsi="Times New Roman" w:cs="Times New Roman"/>
+        </w:rPr>
+      </w:pPr>
+      <w:r>
+        <w:rPr>
+          <w:rFonts w:ascii="Times New Roman" w:hAnsi="Times New Roman" w:cs="Times New Roman"/>
+          <w:b/>
+          <w:bCs/>
+        </w:rPr>
+        <w:t>Valid Gameplay and Win Conditions:</w:t>
+      </w:r>
+      <w:r>
+        <w:rPr>
+          <w:rFonts w:ascii="Times New Roman" w:hAnsi="Times New Roman" w:cs="Times New Roman"/>
+        </w:rPr>
+        <w:t xml:space="preserve"> The game accurately checks for valid melds, enforces game rules, and correctly identifies the winner.</w:t>
+      </w:r>
+    </w:p>
+    <w:p>
+      <w:pPr>
+        <w:numPr>
+          <w:ilvl w:val="0"/>
+          <w:numId w:val="13"/>
+        </w:numPr>
+        <w:rPr>
+          <w:rFonts w:ascii="Times New Roman" w:hAnsi="Times New Roman" w:cs="Times New Roman"/>
+        </w:rPr>
+      </w:pPr>
+      <w:r>
+        <w:rPr>
+          <w:rFonts w:ascii="Times New Roman" w:hAnsi="Times New Roman" w:cs="Times New Roman"/>
+          <w:b/>
+          <w:bCs/>
+        </w:rPr>
+        <w:t>User Interface:</w:t>
+      </w:r>
+      <w:r>
+        <w:rPr>
+          <w:rFonts w:ascii="Times New Roman" w:hAnsi="Times New Roman" w:cs="Times New Roman"/>
+        </w:rPr>
+        <w:t xml:space="preserve"> We created a functional command-line interface that provides clear game updates and prompts for player actions.</w:t>
+      </w:r>
+    </w:p>
+    <w:p>
+      <w:pPr>
+        <w:tabs>
+          <w:tab w:val="num" w:pos="720"/>
+        </w:tabs>
+        <w:rPr>
+          <w:rFonts w:ascii="Times New Roman" w:hAnsi="Times New Roman" w:cs="Times New Roman"/>
+        </w:rPr>
+      </w:pPr>
+      <w:r>
+        <w:rPr>
+          <w:rFonts w:ascii="Times New Roman" w:hAnsi="Times New Roman" w:cs="Times New Roman"/>
+        </w:rPr>
+        <w:t>We were able to achieve these goals, though certain aspects, like the complexity of the computer's AI, were simplified due to time constraints.</w:t>
+      </w:r>
+    </w:p>
+    <w:p>
+      <w:pPr>
+        <w:tabs>
+          <w:tab w:val="num" w:pos="720"/>
+        </w:tabs>
+        <w:rPr>
+          <w:rFonts w:ascii="Times New Roman" w:hAnsi="Times New Roman" w:cs="Times New Roman"/>
+        </w:rPr>
+      </w:pPr>
+      <w:r>
+        <w:rPr>
+          <w:rFonts w:ascii="Times New Roman" w:hAnsi="Times New Roman" w:cs="Times New Roman"/>
+          <w:b/>
+          <w:bCs/>
+        </w:rPr>
+        <w:t>Future Work:</w:t>
+      </w:r>
+    </w:p>
+    <w:p>
+      <w:pPr>
+        <w:tabs>
+          <w:tab w:val="num" w:pos="720"/>
+        </w:tabs>
+        <w:rPr>
+          <w:rFonts w:ascii="Times New Roman" w:hAnsi="Times New Roman" w:cs="Times New Roman"/>
+        </w:rPr>
+      </w:pPr>
+      <w:r>
+        <w:rPr>
+          <w:rFonts w:ascii="Times New Roman" w:hAnsi="Times New Roman" w:cs="Times New Roman"/>
+        </w:rPr>
+        <w:t>Looking ahead, there are several avenues for expanding and improving our Rummy game:</w:t>
+      </w:r>
+    </w:p>
+    <w:p>
+      <w:pPr>
+        <w:numPr>
+          <w:ilvl w:val="0"/>
+          <w:numId w:val="14"/>
+        </w:numPr>
+        <w:rPr>
+          <w:rFonts w:ascii="Times New Roman" w:hAnsi="Times New Roman" w:cs="Times New Roman"/>
+        </w:rPr>
+      </w:pPr>
+      <w:r>
+        <w:rPr>
+          <w:rFonts w:ascii="Times New Roman" w:hAnsi="Times New Roman" w:cs="Times New Roman"/>
+          <w:b/>
+          <w:bCs/>
+        </w:rPr>
+        <w:t>Enhanced Computer AI:</w:t>
+      </w:r>
+      <w:r>
+        <w:rPr>
+          <w:rFonts w:ascii="Times New Roman" w:hAnsi="Times New Roman" w:cs="Times New Roman"/>
+        </w:rPr>
+        <w:t xml:space="preserve"> We could implement more sophisticated AI algorithms to improve the computer's decision-making, making the game more challenging and </w:t>
+      </w:r>
+      <w:r>
+        <w:rPr>
+          <w:rFonts w:ascii="Times New Roman" w:hAnsi="Times New Roman" w:cs="Times New Roman"/>
+        </w:rPr>
+        <w:lastRenderedPageBreak/>
+        <w:t>engaging.</w:t>
+      </w:r>
+      <w:r>
+        <w:rPr>
+          <w:rFonts w:ascii="Times New Roman" w:hAnsi="Times New Roman" w:cs="Times New Roman"/>
+        </w:rPr>
+        <w:t xml:space="preserve"> We could also include the option for the player to play an easy, medium, or hard version of the game, with more sophisticated</w:t>
+      </w:r>
+      <w:r>
+        <w:rPr>
+          <w:rFonts w:ascii="Times New Roman" w:hAnsi="Times New Roman" w:cs="Times New Roman"/>
+        </w:rPr>
+        <w:t xml:space="preserve"> AI as per difficulty level.</w:t>
+      </w:r>
+    </w:p>
+    <w:p>
+      <w:pPr>
+        <w:numPr>
+          <w:ilvl w:val="0"/>
+          <w:numId w:val="14"/>
+        </w:numPr>
+        <w:rPr>
+          <w:rFonts w:ascii="Times New Roman" w:hAnsi="Times New Roman" w:cs="Times New Roman"/>
+        </w:rPr>
+      </w:pPr>
+      <w:r>
+        <w:rPr>
+          <w:rFonts w:ascii="Times New Roman" w:hAnsi="Times New Roman" w:cs="Times New Roman"/>
+          <w:b/>
+          <w:bCs/>
+        </w:rPr>
+        <w:t>Graphical User Interface (GUI):</w:t>
+      </w:r>
+      <w:r>
+        <w:rPr>
+          <w:rFonts w:ascii="Times New Roman" w:hAnsi="Times New Roman" w:cs="Times New Roman"/>
+        </w:rPr>
+        <w:t xml:space="preserve"> Transitioning from a command-line interface to a GUI would significantly enhance the user experience, making the game more visually appealing and intuitive.</w:t>
+      </w:r>
+      <w:r>
+        <w:rPr>
+          <w:rFonts w:ascii="Times New Roman" w:hAnsi="Times New Roman" w:cs="Times New Roman"/>
+        </w:rPr>
+        <w:t xml:space="preserve"> This could include having a visual version of cards </w:t>
+      </w:r>
+      <w:r>
+        <w:rPr>
+          <w:rFonts w:ascii="Times New Roman" w:hAnsi="Times New Roman" w:cs="Times New Roman"/>
+        </w:rPr>
+        <w:t>being shuffled and dealt.</w:t>
+      </w:r>
+    </w:p>
+    <w:p>
+      <w:pPr>
+        <w:numPr>
+          <w:ilvl w:val="0"/>
+          <w:numId w:val="14"/>
+        </w:numPr>
+        <w:rPr>
+          <w:rFonts w:ascii="Times New Roman" w:hAnsi="Times New Roman" w:cs="Times New Roman"/>
+        </w:rPr>
+      </w:pPr>
+      <w:r>
+        <w:rPr>
+          <w:rFonts w:ascii="Times New Roman" w:hAnsi="Times New Roman" w:cs="Times New Roman"/>
+          <w:b/>
+          <w:bCs/>
+        </w:rPr>
+        <w:t>Multiplayer Functionality:</w:t>
+      </w:r>
+      <w:r>
+        <w:rPr>
+          <w:rFonts w:ascii="Times New Roman" w:hAnsi="Times New Roman" w:cs="Times New Roman"/>
+        </w:rPr>
+        <w:t xml:space="preserve"> Adding the ability for multiple human players to compete against each other would add a new dimension to the game.</w:t>
+      </w:r>
+    </w:p>
+    <w:p>
+      <w:pPr>
+        <w:numPr>
+          <w:ilvl w:val="0"/>
+          <w:numId w:val="14"/>
+        </w:numPr>
+        <w:rPr>
+          <w:rFonts w:ascii="Times New Roman" w:hAnsi="Times New Roman" w:cs="Times New Roman"/>
+        </w:rPr>
+      </w:pPr>
+      <w:r>
+        <w:rPr>
+          <w:rFonts w:ascii="Times New Roman" w:hAnsi="Times New Roman" w:cs="Times New Roman"/>
+          <w:b/>
+          <w:bCs/>
+        </w:rPr>
+        <w:t>More Card Games:</w:t>
+      </w:r>
+      <w:r>
+        <w:rPr>
+          <w:rFonts w:ascii="Times New Roman" w:hAnsi="Times New Roman" w:cs="Times New Roman"/>
+        </w:rPr>
+        <w:t xml:space="preserve"> The framework we have developed could be adapted to create other card games, such as Poker, Blackjack, or Cribbage.</w:t>
+      </w:r>
+    </w:p>
+    <w:p>
+      <w:pPr>
+        <w:numPr>
+          <w:ilvl w:val="0"/>
+          <w:numId w:val="14"/>
+        </w:numPr>
+        <w:rPr>
+          <w:rFonts w:ascii="Times New Roman" w:hAnsi="Times New Roman" w:cs="Times New Roman"/>
+        </w:rPr>
+      </w:pPr>
+      <w:r>
+        <w:rPr>
+          <w:rFonts w:ascii="Times New Roman" w:hAnsi="Times New Roman" w:cs="Times New Roman"/>
+          <w:b/>
+          <w:bCs/>
+        </w:rPr>
+        <w:t>Advanced Meld and Layoff Logic:</w:t>
+      </w:r>
+      <w:r>
+        <w:rPr>
+          <w:rFonts w:ascii="Times New Roman" w:hAnsi="Times New Roman" w:cs="Times New Roman"/>
+        </w:rPr>
+        <w:t xml:space="preserve"> More complex logic could be implemented to allow for more strategic melds and layoffs.</w:t>
+      </w:r>
+      <w:r>
+        <w:rPr>
+          <w:rFonts w:ascii="Times New Roman" w:hAnsi="Times New Roman" w:cs="Times New Roman"/>
+        </w:rPr>
+        <w:t xml:space="preserve"> We could also include an AI helper</w:t>
+      </w:r>
+      <w:r>
+        <w:rPr>
+          <w:rFonts w:ascii="Times New Roman" w:hAnsi="Times New Roman" w:cs="Times New Roman"/>
+        </w:rPr>
+        <w:t xml:space="preserve"> for new players who want help in improving their Rummy skills.</w:t>
+      </w:r>
+    </w:p>
+    <w:p>
+      <w:pPr>
+        <w:numPr>
+          <w:ilvl w:val="0"/>
+          <w:numId w:val="14"/>
+        </w:numPr>
+        <w:rPr>
+          <w:rFonts w:ascii="Times New Roman" w:hAnsi="Times New Roman" w:cs="Times New Roman"/>
+        </w:rPr>
+      </w:pPr>
+      <w:r>
+        <w:rPr>
+          <w:rFonts w:ascii="Times New Roman" w:hAnsi="Times New Roman" w:cs="Times New Roman"/>
+          <w:b/>
+          <w:bCs/>
+        </w:rPr>
+        <w:t>Improved Error Handling:</w:t>
+      </w:r>
+      <w:r>
+        <w:rPr>
+          <w:rFonts w:ascii="Times New Roman" w:hAnsi="Times New Roman" w:cs="Times New Roman"/>
+        </w:rPr>
+        <w:t xml:space="preserve"> We could add more robust error handling to prevent issues that could arise from incorrect user input.</w:t>
+      </w:r>
+      <w:r>
+        <w:rPr>
+          <w:rFonts w:ascii="Times New Roman" w:hAnsi="Times New Roman" w:cs="Times New Roman"/>
+        </w:rPr>
+        <w:t xml:space="preserve"> We </w:t>
+      </w:r>
+      <w:proofErr w:type="gramStart"/>
+      <w:r>
+        <w:rPr>
+          <w:rFonts w:ascii="Times New Roman" w:hAnsi="Times New Roman" w:cs="Times New Roman"/>
+        </w:rPr>
+        <w:t>do</w:t>
+      </w:r>
+      <w:proofErr w:type="gramEnd"/>
+      <w:r>
+        <w:rPr>
+          <w:rFonts w:ascii="Times New Roman" w:hAnsi="Times New Roman" w:cs="Times New Roman"/>
+        </w:rPr>
+        <w:t xml:space="preserve"> however, already have a lot of this.</w:t>
+      </w:r>
+    </w:p>
+    <w:p>
+      <w:pPr>
+        <w:tabs>
+          <w:tab w:val="num" w:pos="720"/>
+        </w:tabs>
+        <w:rPr>
+          <w:rFonts w:ascii="Times New Roman" w:hAnsi="Times New Roman" w:cs="Times New Roman"/>
+        </w:rPr>
+      </w:pPr>
+      <w:r>
+        <w:rPr>
+          <w:rFonts w:ascii="Times New Roman" w:hAnsi="Times New Roman" w:cs="Times New Roman"/>
+        </w:rPr>
+        <w:t>In conclusion, this project was a valuable learning experience, allowing us to create a fully functional Rummy game and providing a solid foundation for future development.</w:t>
       </w:r>
     </w:p>
     <w:p>
@@ -2602,9 +3362,28 @@
           <w:rFonts w:ascii="Times New Roman" w:hAnsi="Times New Roman" w:cs="Times New Roman"/>
           <w:b/>
           <w:bCs/>
+          <w:lang w:val="en-US"/>
+        </w:rPr>
+      </w:pPr>
+      <w:r>
+        <w:rPr>
+          <w:rFonts w:ascii="Times New Roman" w:hAnsi="Times New Roman" w:cs="Times New Roman"/>
+          <w:b/>
+          <w:bCs/>
           <w:sz w:val="28"/>
           <w:szCs w:val="28"/>
         </w:rPr>
+        <w:t>External Materials</w:t>
+      </w:r>
+    </w:p>
+    <w:p>
+      <w:pPr>
+        <w:rPr>
+          <w:rFonts w:ascii="Times New Roman" w:hAnsi="Times New Roman" w:cs="Times New Roman"/>
+          <w:b/>
+          <w:bCs/>
+          <w:lang w:val="en-US"/>
+        </w:rPr>
       </w:pPr>
       <w:r>
         <w:rPr>
@@ -2614,18 +3393,8 @@
           <w:sz w:val="28"/>
           <w:szCs w:val="28"/>
         </w:rPr>
-        <w:t>External Materials (optional; if you use any)</w:t>
-      </w:r>
-    </w:p>
-    <w:p>
-      <w:pPr>
-        <w:rPr>
-          <w:rFonts w:ascii="Times New Roman" w:hAnsi="Times New Roman" w:cs="Times New Roman"/>
-          <w:b/>
-          <w:bCs/>
-          <w:lang w:val="en-US"/>
-        </w:rPr>
-      </w:pPr>
+        <w:t xml:space="preserve">a. </w:t>
+      </w:r>
       <w:r>
         <w:rPr>
           <w:rFonts w:ascii="Times New Roman" w:hAnsi="Times New Roman" w:cs="Times New Roman"/>
@@ -2702,8 +3471,16 @@
         <w:rPr>
           <w:rFonts w:ascii="Times New Roman" w:hAnsi="Times New Roman" w:cs="Times New Roman"/>
         </w:rPr>
-        <w:t>*what did celeste use?*</w:t>
-      </w:r>
+        <w:t xml:space="preserve">*what did celeste </w:t>
+      </w:r>
+      <w:proofErr w:type="gramStart"/>
+      <w:r>
+        <w:rPr>
+          <w:rFonts w:ascii="Times New Roman" w:hAnsi="Times New Roman" w:cs="Times New Roman"/>
+        </w:rPr>
+        <w:t>use?*</w:t>
+      </w:r>
+      <w:proofErr w:type="gramEnd"/>
       <w:r>
         <w:rPr>
           <w:rFonts w:ascii="Times New Roman" w:hAnsi="Times New Roman" w:cs="Times New Roman"/>
@@ -2949,6 +3726,7 @@
           <w:rFonts w:ascii="Times New Roman" w:hAnsi="Times New Roman" w:cs="Times New Roman"/>
           <w:lang w:val="en-US"/>
         </w:rPr>
+        <w:lastRenderedPageBreak/>
         <w:t>Sites like w3schools.com</w:t>
       </w:r>
       <w:r>
@@ -3153,6 +3931,9 @@
 <w:hdr xmlns:wpc="http://schemas.microsoft.com/office/word/2010/wordprocessingCanvas" xmlns:cx="http://schemas.microsoft.com/office/drawing/2014/chartex" xmlns:cx1="http://schemas.microsoft.com/office/drawing/2015/9/8/chartex" xmlns:cx2="http://schemas.microsoft.com/office/drawing/2015/10/21/chartex" xmlns:cx3="http://schemas.microsoft.com/office/drawing/2016/5/9/chartex" xmlns:cx4="http://schemas.microsoft.com/office/drawing/2016/5/10/chartex" xmlns:cx5="http://schemas.microsoft.com/office/drawing/2016/5/11/chartex" xmlns:cx6="http://schemas.microsoft.com/office/drawing/2016/5/12/chartex" xmlns:cx7="http://schemas.microsoft.com/office/drawing/2016/5/13/chartex" xmlns:cx8="http://schemas.microsoft.com/office/drawing/2016/5/14/chartex" xmlns:mc="http://schemas.openxmlformats.org/markup-compatibility/2006" xmlns:aink="http://schemas.microsoft.com/office/drawing/2016/ink" xmlns:am3d="http://schemas.microsoft.com/office/drawing/2017/model3d" xmlns:o="urn:schemas-microsoft-com:office:office" xmlns:oel="http://schemas.microsoft.com/office/2019/extlst" xmlns:r="http://schemas.openxmlformats.org/officeDocument/2006/relationships" xmlns:m="http://schemas.openxmlformats.org/officeDocument/2006/math" xmlns:v="urn:schemas-microsoft-com:vml" xmlns:wp14="http://schemas.microsoft.com/office/word/2010/wordprocessingDrawing" xmlns:wp="http://schemas.openxmlformats.org/drawingml/2006/wordprocessingDrawing" xmlns:w10="urn:schemas-microsoft-com:office:word" xmlns:w="http://schemas.openxmlformats.org/wordprocessingml/2006/main" xmlns:w14="http://schemas.microsoft.com/office/word/2010/wordml" xmlns:w15="http://schemas.microsoft.com/office/word/2012/wordml" xmlns:w16cex="http://schemas.microsoft.com/office/word/2018/wordml/cex" xmlns:w16cid="http://schemas.microsoft.com/office/word/2016/wordml/cid" xmlns:w16="http://schemas.microsoft.com/office/word/2018/wordml" xmlns:w16du="http://schemas.microsoft.com/office/word/2023/wordml/word16du" xmlns:w16sdtdh="http://schemas.microsoft.com/office/word/2020/wordml/sdtdatahash" xmlns:w16sdtfl="http://schemas.microsoft.com/office/word/2024/wordml/sdtformatlock" xmlns:w16se="http://schemas.microsoft.com/office/word/2015/wordml/symex" xmlns:wpg="http://schemas.microsoft.com/office/word/2010/wordprocessingGroup" xmlns:wpi="http://schemas.microsoft.com/office/word/2010/wordprocessingInk" xmlns:wne="http://schemas.microsoft.com/office/word/2006/wordml" xmlns:wps="http://schemas.microsoft.com/office/word/2010/wordprocessingShape" mc:Ignorable="w14 w15 w16se w16cid w16 w16cex w16sdtdh w16sdtfl w16du wp14">
   <w:sdt>
     <w:sdtPr>
+      <w:rPr>
+        <w:rFonts w:ascii="Times New Roman" w:hAnsi="Times New Roman" w:cs="Times New Roman"/>
+      </w:rPr>
       <w:id w:val="-58794562"/>
       <w:docPartObj>
         <w:docPartGallery w:val="Page Numbers (Top of Page)"/>
@@ -3161,7 +3942,6 @@
     </w:sdtPr>
     <w:sdtEndPr>
       <w:rPr>
-        <w:rFonts w:ascii="Times New Roman" w:hAnsi="Times New Roman" w:cs="Times New Roman"/>
         <w:noProof/>
       </w:rPr>
     </w:sdtEndPr>
@@ -3174,6 +3954,12 @@
             <w:rFonts w:ascii="Times New Roman" w:hAnsi="Times New Roman" w:cs="Times New Roman"/>
           </w:rPr>
         </w:pPr>
+        <w:r>
+          <w:rPr>
+            <w:rFonts w:ascii="Times New Roman" w:hAnsi="Times New Roman" w:cs="Times New Roman"/>
+          </w:rPr>
+          <w:t xml:space="preserve">Jindal and Lopez Boulton </w:t>
+        </w:r>
         <w:r>
           <w:rPr>
             <w:rFonts w:ascii="Times New Roman" w:hAnsi="Times New Roman" w:cs="Times New Roman"/>
@@ -3212,6 +3998,9 @@
   <w:p>
     <w:pPr>
       <w:pStyle w:val="Header"/>
+      <w:rPr>
+        <w:rFonts w:ascii="Times New Roman" w:hAnsi="Times New Roman" w:cs="Times New Roman"/>
+      </w:rPr>
     </w:pPr>
   </w:p>
 </w:hdr>
@@ -3333,6 +4122,119 @@
     </w:lvl>
   </w:abstractNum>
   <w:abstractNum w:abstractNumId="1" w15:restartNumberingAfterBreak="0">
+    <w:nsid w:val="29C820B0"/>
+    <w:multiLevelType w:val="multilevel"/>
+    <w:tmpl w:val="5E542D8A"/>
+    <w:lvl w:ilvl="0">
+      <w:start w:val="1"/>
+      <w:numFmt w:val="decimal"/>
+      <w:lvlText w:val="%1."/>
+      <w:lvlJc w:val="left"/>
+      <w:pPr>
+        <w:tabs>
+          <w:tab w:val="num" w:pos="720"/>
+        </w:tabs>
+        <w:ind w:left="720" w:hanging="360"/>
+      </w:pPr>
+    </w:lvl>
+    <w:lvl w:ilvl="1" w:tentative="1">
+      <w:start w:val="1"/>
+      <w:numFmt w:val="decimal"/>
+      <w:lvlText w:val="%2."/>
+      <w:lvlJc w:val="left"/>
+      <w:pPr>
+        <w:tabs>
+          <w:tab w:val="num" w:pos="1440"/>
+        </w:tabs>
+        <w:ind w:left="1440" w:hanging="360"/>
+      </w:pPr>
+    </w:lvl>
+    <w:lvl w:ilvl="2" w:tentative="1">
+      <w:start w:val="1"/>
+      <w:numFmt w:val="decimal"/>
+      <w:lvlText w:val="%3."/>
+      <w:lvlJc w:val="left"/>
+      <w:pPr>
+        <w:tabs>
+          <w:tab w:val="num" w:pos="2160"/>
+        </w:tabs>
+        <w:ind w:left="2160" w:hanging="360"/>
+      </w:pPr>
+    </w:lvl>
+    <w:lvl w:ilvl="3" w:tentative="1">
+      <w:start w:val="1"/>
+      <w:numFmt w:val="decimal"/>
+      <w:lvlText w:val="%4."/>
+      <w:lvlJc w:val="left"/>
+      <w:pPr>
+        <w:tabs>
+          <w:tab w:val="num" w:pos="2880"/>
+        </w:tabs>
+        <w:ind w:left="2880" w:hanging="360"/>
+      </w:pPr>
+    </w:lvl>
+    <w:lvl w:ilvl="4" w:tentative="1">
+      <w:start w:val="1"/>
+      <w:numFmt w:val="decimal"/>
+      <w:lvlText w:val="%5."/>
+      <w:lvlJc w:val="left"/>
+      <w:pPr>
+        <w:tabs>
+          <w:tab w:val="num" w:pos="3600"/>
+        </w:tabs>
+        <w:ind w:left="3600" w:hanging="360"/>
+      </w:pPr>
+    </w:lvl>
+    <w:lvl w:ilvl="5" w:tentative="1">
+      <w:start w:val="1"/>
+      <w:numFmt w:val="decimal"/>
+      <w:lvlText w:val="%6."/>
+      <w:lvlJc w:val="left"/>
+      <w:pPr>
+        <w:tabs>
+          <w:tab w:val="num" w:pos="4320"/>
+        </w:tabs>
+        <w:ind w:left="4320" w:hanging="360"/>
+      </w:pPr>
+    </w:lvl>
+    <w:lvl w:ilvl="6" w:tentative="1">
+      <w:start w:val="1"/>
+      <w:numFmt w:val="decimal"/>
+      <w:lvlText w:val="%7."/>
+      <w:lvlJc w:val="left"/>
+      <w:pPr>
+        <w:tabs>
+          <w:tab w:val="num" w:pos="5040"/>
+        </w:tabs>
+        <w:ind w:left="5040" w:hanging="360"/>
+      </w:pPr>
+    </w:lvl>
+    <w:lvl w:ilvl="7" w:tentative="1">
+      <w:start w:val="1"/>
+      <w:numFmt w:val="decimal"/>
+      <w:lvlText w:val="%8."/>
+      <w:lvlJc w:val="left"/>
+      <w:pPr>
+        <w:tabs>
+          <w:tab w:val="num" w:pos="5760"/>
+        </w:tabs>
+        <w:ind w:left="5760" w:hanging="360"/>
+      </w:pPr>
+    </w:lvl>
+    <w:lvl w:ilvl="8" w:tentative="1">
+      <w:start w:val="1"/>
+      <w:numFmt w:val="decimal"/>
+      <w:lvlText w:val="%9."/>
+      <w:lvlJc w:val="left"/>
+      <w:pPr>
+        <w:tabs>
+          <w:tab w:val="num" w:pos="6480"/>
+        </w:tabs>
+        <w:ind w:left="6480" w:hanging="360"/>
+      </w:pPr>
+    </w:lvl>
+  </w:abstractNum>
+  <w:abstractNum w:abstractNumId="2" w15:restartNumberingAfterBreak="0">
     <w:nsid w:val="303A5916"/>
     <w:multiLevelType w:val="multilevel"/>
     <w:tmpl w:val="1C6CC7F4"/>
@@ -3445,7 +4347,305 @@
       </w:rPr>
     </w:lvl>
   </w:abstractNum>
-  <w:abstractNum w:abstractNumId="2" w15:restartNumberingAfterBreak="0">
+  <w:abstractNum w:abstractNumId="3" w15:restartNumberingAfterBreak="0">
+    <w:nsid w:val="327327A2"/>
+    <w:multiLevelType w:val="multilevel"/>
+    <w:tmpl w:val="37761276"/>
+    <w:lvl w:ilvl="0">
+      <w:start w:val="1"/>
+      <w:numFmt w:val="bullet"/>
+      <w:lvlText w:val=""/>
+      <w:lvlJc w:val="left"/>
+      <w:pPr>
+        <w:tabs>
+          <w:tab w:val="num" w:pos="720"/>
+        </w:tabs>
+        <w:ind w:left="720" w:hanging="360"/>
+      </w:pPr>
+      <w:rPr>
+        <w:rFonts w:ascii="Symbol" w:hAnsi="Symbol" w:hint="default"/>
+        <w:sz w:val="20"/>
+      </w:rPr>
+    </w:lvl>
+    <w:lvl w:ilvl="1" w:tentative="1">
+      <w:start w:val="1"/>
+      <w:numFmt w:val="bullet"/>
+      <w:lvlText w:val="o"/>
+      <w:lvlJc w:val="left"/>
+      <w:pPr>
+        <w:tabs>
+          <w:tab w:val="num" w:pos="1440"/>
+        </w:tabs>
+        <w:ind w:left="1440" w:hanging="360"/>
+      </w:pPr>
+      <w:rPr>
+        <w:rFonts w:ascii="Courier New" w:hAnsi="Courier New" w:hint="default"/>
+        <w:sz w:val="20"/>
+      </w:rPr>
+    </w:lvl>
+    <w:lvl w:ilvl="2" w:tentative="1">
+      <w:start w:val="1"/>
+      <w:numFmt w:val="bullet"/>
+      <w:lvlText w:val=""/>
+      <w:lvlJc w:val="left"/>
+      <w:pPr>
+        <w:tabs>
+          <w:tab w:val="num" w:pos="2160"/>
+        </w:tabs>
+        <w:ind w:left="2160" w:hanging="360"/>
+      </w:pPr>
+      <w:rPr>
+        <w:rFonts w:ascii="Wingdings" w:hAnsi="Wingdings" w:hint="default"/>
+        <w:sz w:val="20"/>
+      </w:rPr>
+    </w:lvl>
+    <w:lvl w:ilvl="3" w:tentative="1">
+      <w:start w:val="1"/>
+      <w:numFmt w:val="bullet"/>
+      <w:lvlText w:val=""/>
+      <w:lvlJc w:val="left"/>
+      <w:pPr>
+        <w:tabs>
+          <w:tab w:val="num" w:pos="2880"/>
+        </w:tabs>
+        <w:ind w:left="2880" w:hanging="360"/>
+      </w:pPr>
+      <w:rPr>
+        <w:rFonts w:ascii="Wingdings" w:hAnsi="Wingdings" w:hint="default"/>
+        <w:sz w:val="20"/>
+      </w:rPr>
+    </w:lvl>
+    <w:lvl w:ilvl="4" w:tentative="1">
+      <w:start w:val="1"/>
+      <w:numFmt w:val="bullet"/>
+      <w:lvlText w:val=""/>
+      <w:lvlJc w:val="left"/>
+      <w:pPr>
+        <w:tabs>
+          <w:tab w:val="num" w:pos="3600"/>
+        </w:tabs>
+        <w:ind w:left="3600" w:hanging="360"/>
+      </w:pPr>
+      <w:rPr>
+        <w:rFonts w:ascii="Wingdings" w:hAnsi="Wingdings" w:hint="default"/>
+        <w:sz w:val="20"/>
+      </w:rPr>
+    </w:lvl>
+    <w:lvl w:ilvl="5" w:tentative="1">
+      <w:start w:val="1"/>
+      <w:numFmt w:val="bullet"/>
+      <w:lvlText w:val=""/>
+      <w:lvlJc w:val="left"/>
+      <w:pPr>
+        <w:tabs>
+          <w:tab w:val="num" w:pos="4320"/>
+        </w:tabs>
+        <w:ind w:left="4320" w:hanging="360"/>
+      </w:pPr>
+      <w:rPr>
+        <w:rFonts w:ascii="Wingdings" w:hAnsi="Wingdings" w:hint="default"/>
+        <w:sz w:val="20"/>
+      </w:rPr>
+    </w:lvl>
+    <w:lvl w:ilvl="6" w:tentative="1">
+      <w:start w:val="1"/>
+      <w:numFmt w:val="bullet"/>
+      <w:lvlText w:val=""/>
+      <w:lvlJc w:val="left"/>
+      <w:pPr>
+        <w:tabs>
+          <w:tab w:val="num" w:pos="5040"/>
+        </w:tabs>
+        <w:ind w:left="5040" w:hanging="360"/>
+      </w:pPr>
+      <w:rPr>
+        <w:rFonts w:ascii="Wingdings" w:hAnsi="Wingdings" w:hint="default"/>
+        <w:sz w:val="20"/>
+      </w:rPr>
+    </w:lvl>
+    <w:lvl w:ilvl="7" w:tentative="1">
+      <w:start w:val="1"/>
+      <w:numFmt w:val="bullet"/>
+      <w:lvlText w:val=""/>
+      <w:lvlJc w:val="left"/>
+      <w:pPr>
+        <w:tabs>
+          <w:tab w:val="num" w:pos="5760"/>
+        </w:tabs>
+        <w:ind w:left="5760" w:hanging="360"/>
+      </w:pPr>
+      <w:rPr>
+        <w:rFonts w:ascii="Wingdings" w:hAnsi="Wingdings" w:hint="default"/>
+        <w:sz w:val="20"/>
+      </w:rPr>
+    </w:lvl>
+    <w:lvl w:ilvl="8" w:tentative="1">
+      <w:start w:val="1"/>
+      <w:numFmt w:val="bullet"/>
+      <w:lvlText w:val=""/>
+      <w:lvlJc w:val="left"/>
+      <w:pPr>
+        <w:tabs>
+          <w:tab w:val="num" w:pos="6480"/>
+        </w:tabs>
+        <w:ind w:left="6480" w:hanging="360"/>
+      </w:pPr>
+      <w:rPr>
+        <w:rFonts w:ascii="Wingdings" w:hAnsi="Wingdings" w:hint="default"/>
+        <w:sz w:val="20"/>
+      </w:rPr>
+    </w:lvl>
+  </w:abstractNum>
+  <w:abstractNum w:abstractNumId="4" w15:restartNumberingAfterBreak="0">
+    <w:nsid w:val="3447572D"/>
+    <w:multiLevelType w:val="multilevel"/>
+    <w:tmpl w:val="39A83F3A"/>
+    <w:lvl w:ilvl="0">
+      <w:start w:val="1"/>
+      <w:numFmt w:val="bullet"/>
+      <w:lvlText w:val=""/>
+      <w:lvlJc w:val="left"/>
+      <w:pPr>
+        <w:tabs>
+          <w:tab w:val="num" w:pos="720"/>
+        </w:tabs>
+        <w:ind w:left="720" w:hanging="360"/>
+      </w:pPr>
+      <w:rPr>
+        <w:rFonts w:ascii="Symbol" w:hAnsi="Symbol" w:hint="default"/>
+        <w:sz w:val="20"/>
+      </w:rPr>
+    </w:lvl>
+    <w:lvl w:ilvl="1" w:tentative="1">
+      <w:start w:val="1"/>
+      <w:numFmt w:val="bullet"/>
+      <w:lvlText w:val="o"/>
+      <w:lvlJc w:val="left"/>
+      <w:pPr>
+        <w:tabs>
+          <w:tab w:val="num" w:pos="1440"/>
+        </w:tabs>
+        <w:ind w:left="1440" w:hanging="360"/>
+      </w:pPr>
+      <w:rPr>
+        <w:rFonts w:ascii="Courier New" w:hAnsi="Courier New" w:hint="default"/>
+        <w:sz w:val="20"/>
+      </w:rPr>
+    </w:lvl>
+    <w:lvl w:ilvl="2" w:tentative="1">
+      <w:start w:val="1"/>
+      <w:numFmt w:val="bullet"/>
+      <w:lvlText w:val=""/>
+      <w:lvlJc w:val="left"/>
+      <w:pPr>
+        <w:tabs>
+          <w:tab w:val="num" w:pos="2160"/>
+        </w:tabs>
+        <w:ind w:left="2160" w:hanging="360"/>
+      </w:pPr>
+      <w:rPr>
+        <w:rFonts w:ascii="Wingdings" w:hAnsi="Wingdings" w:hint="default"/>
+        <w:sz w:val="20"/>
+      </w:rPr>
+    </w:lvl>
+    <w:lvl w:ilvl="3" w:tentative="1">
+      <w:start w:val="1"/>
+      <w:numFmt w:val="bullet"/>
+      <w:lvlText w:val=""/>
+      <w:lvlJc w:val="left"/>
+      <w:pPr>
+        <w:tabs>
+          <w:tab w:val="num" w:pos="2880"/>
+        </w:tabs>
+        <w:ind w:left="2880" w:hanging="360"/>
+      </w:pPr>
+      <w:rPr>
+        <w:rFonts w:ascii="Wingdings" w:hAnsi="Wingdings" w:hint="default"/>
+        <w:sz w:val="20"/>
+      </w:rPr>
+    </w:lvl>
+    <w:lvl w:ilvl="4" w:tentative="1">
+      <w:start w:val="1"/>
+      <w:numFmt w:val="bullet"/>
+      <w:lvlText w:val=""/>
+      <w:lvlJc w:val="left"/>
+      <w:pPr>
+        <w:tabs>
+          <w:tab w:val="num" w:pos="3600"/>
+        </w:tabs>
+        <w:ind w:left="3600" w:hanging="360"/>
+      </w:pPr>
+      <w:rPr>
+        <w:rFonts w:ascii="Wingdings" w:hAnsi="Wingdings" w:hint="default"/>
+        <w:sz w:val="20"/>
+      </w:rPr>
+    </w:lvl>
+    <w:lvl w:ilvl="5" w:tentative="1">
+      <w:start w:val="1"/>
+      <w:numFmt w:val="bullet"/>
+      <w:lvlText w:val=""/>
+      <w:lvlJc w:val="left"/>
+      <w:pPr>
+        <w:tabs>
+          <w:tab w:val="num" w:pos="4320"/>
+        </w:tabs>
+        <w:ind w:left="4320" w:hanging="360"/>
+      </w:pPr>
+      <w:rPr>
+        <w:rFonts w:ascii="Wingdings" w:hAnsi="Wingdings" w:hint="default"/>
+        <w:sz w:val="20"/>
+      </w:rPr>
+    </w:lvl>
+    <w:lvl w:ilvl="6" w:tentative="1">
+      <w:start w:val="1"/>
+      <w:numFmt w:val="bullet"/>
+      <w:lvlText w:val=""/>
+      <w:lvlJc w:val="left"/>
+      <w:pPr>
+        <w:tabs>
+          <w:tab w:val="num" w:pos="5040"/>
+        </w:tabs>
+        <w:ind w:left="5040" w:hanging="360"/>
+      </w:pPr>
+      <w:rPr>
+        <w:rFonts w:ascii="Wingdings" w:hAnsi="Wingdings" w:hint="default"/>
+        <w:sz w:val="20"/>
+      </w:rPr>
+    </w:lvl>
+    <w:lvl w:ilvl="7" w:tentative="1">
+      <w:start w:val="1"/>
+      <w:numFmt w:val="bullet"/>
+      <w:lvlText w:val=""/>
+      <w:lvlJc w:val="left"/>
+      <w:pPr>
+        <w:tabs>
+          <w:tab w:val="num" w:pos="5760"/>
+        </w:tabs>
+        <w:ind w:left="5760" w:hanging="360"/>
+      </w:pPr>
+      <w:rPr>
+        <w:rFonts w:ascii="Wingdings" w:hAnsi="Wingdings" w:hint="default"/>
+        <w:sz w:val="20"/>
+      </w:rPr>
+    </w:lvl>
+    <w:lvl w:ilvl="8" w:tentative="1">
+      <w:start w:val="1"/>
+      <w:numFmt w:val="bullet"/>
+      <w:lvlText w:val=""/>
+      <w:lvlJc w:val="left"/>
+      <w:pPr>
+        <w:tabs>
+          <w:tab w:val="num" w:pos="6480"/>
+        </w:tabs>
+        <w:ind w:left="6480" w:hanging="360"/>
+      </w:pPr>
+      <w:rPr>
+        <w:rFonts w:ascii="Wingdings" w:hAnsi="Wingdings" w:hint="default"/>
+        <w:sz w:val="20"/>
+      </w:rPr>
+    </w:lvl>
+  </w:abstractNum>
+  <w:abstractNum w:abstractNumId="5" w15:restartNumberingAfterBreak="0">
     <w:nsid w:val="39506955"/>
     <w:multiLevelType w:val="multilevel"/>
     <w:tmpl w:val="7F86A562"/>
@@ -3558,7 +4758,7 @@
       </w:rPr>
     </w:lvl>
   </w:abstractNum>
-  <w:abstractNum w:abstractNumId="3" w15:restartNumberingAfterBreak="0">
+  <w:abstractNum w:abstractNumId="6" w15:restartNumberingAfterBreak="0">
     <w:nsid w:val="3AA34059"/>
     <w:multiLevelType w:val="multilevel"/>
     <w:tmpl w:val="1C6CC7F4"/>
@@ -3671,7 +4871,7 @@
       </w:rPr>
     </w:lvl>
   </w:abstractNum>
-  <w:abstractNum w:abstractNumId="4" w15:restartNumberingAfterBreak="0">
+  <w:abstractNum w:abstractNumId="7" w15:restartNumberingAfterBreak="0">
     <w:nsid w:val="3AA930BB"/>
     <w:multiLevelType w:val="multilevel"/>
     <w:tmpl w:val="7F86A562"/>
@@ -3784,7 +4984,7 @@
       </w:rPr>
     </w:lvl>
   </w:abstractNum>
-  <w:abstractNum w:abstractNumId="5" w15:restartNumberingAfterBreak="0">
+  <w:abstractNum w:abstractNumId="8" w15:restartNumberingAfterBreak="0">
     <w:nsid w:val="5C420BAD"/>
     <w:multiLevelType w:val="multilevel"/>
     <w:tmpl w:val="7F86A562"/>
@@ -3897,7 +5097,156 @@
       </w:rPr>
     </w:lvl>
   </w:abstractNum>
-  <w:abstractNum w:abstractNumId="6" w15:restartNumberingAfterBreak="0">
+  <w:abstractNum w:abstractNumId="9" w15:restartNumberingAfterBreak="0">
+    <w:nsid w:val="60C060B8"/>
+    <w:multiLevelType w:val="multilevel"/>
+    <w:tmpl w:val="83688D02"/>
+    <w:lvl w:ilvl="0">
+      <w:start w:val="1"/>
+      <w:numFmt w:val="bullet"/>
+      <w:lvlText w:val=""/>
+      <w:lvlJc w:val="left"/>
+      <w:pPr>
+        <w:tabs>
+          <w:tab w:val="num" w:pos="720"/>
+        </w:tabs>
+        <w:ind w:left="720" w:hanging="360"/>
+      </w:pPr>
+      <w:rPr>
+        <w:rFonts w:ascii="Symbol" w:hAnsi="Symbol" w:hint="default"/>
+        <w:sz w:val="20"/>
+      </w:rPr>
+    </w:lvl>
+    <w:lvl w:ilvl="1">
+      <w:start w:val="1"/>
+      <w:numFmt w:val="bullet"/>
+      <w:lvlText w:val="o"/>
+      <w:lvlJc w:val="left"/>
+      <w:pPr>
+        <w:tabs>
+          <w:tab w:val="num" w:pos="1440"/>
+        </w:tabs>
+        <w:ind w:left="1440" w:hanging="360"/>
+      </w:pPr>
+      <w:rPr>
+        <w:rFonts w:ascii="Courier New" w:hAnsi="Courier New" w:hint="default"/>
+        <w:sz w:val="20"/>
+      </w:rPr>
+    </w:lvl>
+    <w:lvl w:ilvl="2" w:tentative="1">
+      <w:start w:val="1"/>
+      <w:numFmt w:val="bullet"/>
+      <w:lvlText w:val=""/>
+      <w:lvlJc w:val="left"/>
+      <w:pPr>
+        <w:tabs>
+          <w:tab w:val="num" w:pos="2160"/>
+        </w:tabs>
+        <w:ind w:left="2160" w:hanging="360"/>
+      </w:pPr>
+      <w:rPr>
+        <w:rFonts w:ascii="Wingdings" w:hAnsi="Wingdings" w:hint="default"/>
+        <w:sz w:val="20"/>
+      </w:rPr>
+    </w:lvl>
+    <w:lvl w:ilvl="3" w:tentative="1">
+      <w:start w:val="1"/>
+      <w:numFmt w:val="bullet"/>
+      <w:lvlText w:val=""/>
+      <w:lvlJc w:val="left"/>
+      <w:pPr>
+        <w:tabs>
+          <w:tab w:val="num" w:pos="2880"/>
+        </w:tabs>
+        <w:ind w:left="2880" w:hanging="360"/>
+      </w:pPr>
+      <w:rPr>
+        <w:rFonts w:ascii="Wingdings" w:hAnsi="Wingdings" w:hint="default"/>
+        <w:sz w:val="20"/>
+      </w:rPr>
+    </w:lvl>
+    <w:lvl w:ilvl="4" w:tentative="1">
+      <w:start w:val="1"/>
+      <w:numFmt w:val="bullet"/>
+      <w:lvlText w:val=""/>
+      <w:lvlJc w:val="left"/>
+      <w:pPr>
+        <w:tabs>
+          <w:tab w:val="num" w:pos="3600"/>
+        </w:tabs>
+        <w:ind w:left="3600" w:hanging="360"/>
+      </w:pPr>
+      <w:rPr>
+        <w:rFonts w:ascii="Wingdings" w:hAnsi="Wingdings" w:hint="default"/>
+        <w:sz w:val="20"/>
+      </w:rPr>
+    </w:lvl>
+    <w:lvl w:ilvl="5" w:tentative="1">
+      <w:start w:val="1"/>
+      <w:numFmt w:val="bullet"/>
+      <w:lvlText w:val=""/>
+      <w:lvlJc w:val="left"/>
+      <w:pPr>
+        <w:tabs>
+          <w:tab w:val="num" w:pos="4320"/>
+        </w:tabs>
+        <w:ind w:left="4320" w:hanging="360"/>
+      </w:pPr>
+      <w:rPr>
+        <w:rFonts w:ascii="Wingdings" w:hAnsi="Wingdings" w:hint="default"/>
+        <w:sz w:val="20"/>
+      </w:rPr>
+    </w:lvl>
+    <w:lvl w:ilvl="6" w:tentative="1">
+      <w:start w:val="1"/>
+      <w:numFmt w:val="bullet"/>
+      <w:lvlText w:val=""/>
+      <w:lvlJc w:val="left"/>
+      <w:pPr>
+        <w:tabs>
+          <w:tab w:val="num" w:pos="5040"/>
+        </w:tabs>
+        <w:ind w:left="5040" w:hanging="360"/>
+      </w:pPr>
+      <w:rPr>
+        <w:rFonts w:ascii="Wingdings" w:hAnsi="Wingdings" w:hint="default"/>
+        <w:sz w:val="20"/>
+      </w:rPr>
+    </w:lvl>
+    <w:lvl w:ilvl="7" w:tentative="1">
+      <w:start w:val="1"/>
+      <w:numFmt w:val="bullet"/>
+      <w:lvlText w:val=""/>
+      <w:lvlJc w:val="left"/>
+      <w:pPr>
+        <w:tabs>
+          <w:tab w:val="num" w:pos="5760"/>
+        </w:tabs>
+        <w:ind w:left="5760" w:hanging="360"/>
+      </w:pPr>
+      <w:rPr>
+        <w:rFonts w:ascii="Wingdings" w:hAnsi="Wingdings" w:hint="default"/>
+        <w:sz w:val="20"/>
+      </w:rPr>
+    </w:lvl>
+    <w:lvl w:ilvl="8" w:tentative="1">
+      <w:start w:val="1"/>
+      <w:numFmt w:val="bullet"/>
+      <w:lvlText w:val=""/>
+      <w:lvlJc w:val="left"/>
+      <w:pPr>
+        <w:tabs>
+          <w:tab w:val="num" w:pos="6480"/>
+        </w:tabs>
+        <w:ind w:left="6480" w:hanging="360"/>
+      </w:pPr>
+      <w:rPr>
+        <w:rFonts w:ascii="Wingdings" w:hAnsi="Wingdings" w:hint="default"/>
+        <w:sz w:val="20"/>
+      </w:rPr>
+    </w:lvl>
+  </w:abstractNum>
+  <w:abstractNum w:abstractNumId="10" w15:restartNumberingAfterBreak="0">
     <w:nsid w:val="61E60C43"/>
     <w:multiLevelType w:val="multilevel"/>
     <w:tmpl w:val="7F86A562"/>
@@ -4010,7 +5359,7 @@
       </w:rPr>
     </w:lvl>
   </w:abstractNum>
-  <w:abstractNum w:abstractNumId="7" w15:restartNumberingAfterBreak="0">
+  <w:abstractNum w:abstractNumId="11" w15:restartNumberingAfterBreak="0">
     <w:nsid w:val="663E2936"/>
     <w:multiLevelType w:val="multilevel"/>
     <w:tmpl w:val="7F86A562"/>
@@ -4123,7 +5472,7 @@
       </w:rPr>
     </w:lvl>
   </w:abstractNum>
-  <w:abstractNum w:abstractNumId="8" w15:restartNumberingAfterBreak="0">
+  <w:abstractNum w:abstractNumId="12" w15:restartNumberingAfterBreak="0">
     <w:nsid w:val="79417E81"/>
     <w:multiLevelType w:val="multilevel"/>
     <w:tmpl w:val="7F86A562"/>
@@ -4236,32 +5585,196 @@
       </w:rPr>
     </w:lvl>
   </w:abstractNum>
+  <w:abstractNum w:abstractNumId="13" w15:restartNumberingAfterBreak="0">
+    <w:nsid w:val="7CD72704"/>
+    <w:multiLevelType w:val="multilevel"/>
+    <w:tmpl w:val="03FC3906"/>
+    <w:lvl w:ilvl="0">
+      <w:start w:val="1"/>
+      <w:numFmt w:val="bullet"/>
+      <w:lvlText w:val=""/>
+      <w:lvlJc w:val="left"/>
+      <w:pPr>
+        <w:tabs>
+          <w:tab w:val="num" w:pos="720"/>
+        </w:tabs>
+        <w:ind w:left="720" w:hanging="360"/>
+      </w:pPr>
+      <w:rPr>
+        <w:rFonts w:ascii="Symbol" w:hAnsi="Symbol" w:hint="default"/>
+        <w:sz w:val="20"/>
+      </w:rPr>
+    </w:lvl>
+    <w:lvl w:ilvl="1" w:tentative="1">
+      <w:start w:val="1"/>
+      <w:numFmt w:val="bullet"/>
+      <w:lvlText w:val="o"/>
+      <w:lvlJc w:val="left"/>
+      <w:pPr>
+        <w:tabs>
+          <w:tab w:val="num" w:pos="1440"/>
+        </w:tabs>
+        <w:ind w:left="1440" w:hanging="360"/>
+      </w:pPr>
+      <w:rPr>
+        <w:rFonts w:ascii="Courier New" w:hAnsi="Courier New" w:hint="default"/>
+        <w:sz w:val="20"/>
+      </w:rPr>
+    </w:lvl>
+    <w:lvl w:ilvl="2" w:tentative="1">
+      <w:start w:val="1"/>
+      <w:numFmt w:val="bullet"/>
+      <w:lvlText w:val=""/>
+      <w:lvlJc w:val="left"/>
+      <w:pPr>
+        <w:tabs>
+          <w:tab w:val="num" w:pos="2160"/>
+        </w:tabs>
+        <w:ind w:left="2160" w:hanging="360"/>
+      </w:pPr>
+      <w:rPr>
+        <w:rFonts w:ascii="Wingdings" w:hAnsi="Wingdings" w:hint="default"/>
+        <w:sz w:val="20"/>
+      </w:rPr>
+    </w:lvl>
+    <w:lvl w:ilvl="3" w:tentative="1">
+      <w:start w:val="1"/>
+      <w:numFmt w:val="bullet"/>
+      <w:lvlText w:val=""/>
+      <w:lvlJc w:val="left"/>
+      <w:pPr>
+        <w:tabs>
+          <w:tab w:val="num" w:pos="2880"/>
+        </w:tabs>
+        <w:ind w:left="2880" w:hanging="360"/>
+      </w:pPr>
+      <w:rPr>
+        <w:rFonts w:ascii="Wingdings" w:hAnsi="Wingdings" w:hint="default"/>
+        <w:sz w:val="20"/>
+      </w:rPr>
+    </w:lvl>
+    <w:lvl w:ilvl="4" w:tentative="1">
+      <w:start w:val="1"/>
+      <w:numFmt w:val="bullet"/>
+      <w:lvlText w:val=""/>
+      <w:lvlJc w:val="left"/>
+      <w:pPr>
+        <w:tabs>
+          <w:tab w:val="num" w:pos="3600"/>
+        </w:tabs>
+        <w:ind w:left="3600" w:hanging="360"/>
+      </w:pPr>
+      <w:rPr>
+        <w:rFonts w:ascii="Wingdings" w:hAnsi="Wingdings" w:hint="default"/>
+        <w:sz w:val="20"/>
+      </w:rPr>
+    </w:lvl>
+    <w:lvl w:ilvl="5" w:tentative="1">
+      <w:start w:val="1"/>
+      <w:numFmt w:val="bullet"/>
+      <w:lvlText w:val=""/>
+      <w:lvlJc w:val="left"/>
+      <w:pPr>
+        <w:tabs>
+          <w:tab w:val="num" w:pos="4320"/>
+        </w:tabs>
+        <w:ind w:left="4320" w:hanging="360"/>
+      </w:pPr>
+      <w:rPr>
+        <w:rFonts w:ascii="Wingdings" w:hAnsi="Wingdings" w:hint="default"/>
+        <w:sz w:val="20"/>
+      </w:rPr>
+    </w:lvl>
+    <w:lvl w:ilvl="6" w:tentative="1">
+      <w:start w:val="1"/>
+      <w:numFmt w:val="bullet"/>
+      <w:lvlText w:val=""/>
+      <w:lvlJc w:val="left"/>
+      <w:pPr>
+        <w:tabs>
+          <w:tab w:val="num" w:pos="5040"/>
+        </w:tabs>
+        <w:ind w:left="5040" w:hanging="360"/>
+      </w:pPr>
+      <w:rPr>
+        <w:rFonts w:ascii="Wingdings" w:hAnsi="Wingdings" w:hint="default"/>
+        <w:sz w:val="20"/>
+      </w:rPr>
+    </w:lvl>
+    <w:lvl w:ilvl="7" w:tentative="1">
+      <w:start w:val="1"/>
+      <w:numFmt w:val="bullet"/>
+      <w:lvlText w:val=""/>
+      <w:lvlJc w:val="left"/>
+      <w:pPr>
+        <w:tabs>
+          <w:tab w:val="num" w:pos="5760"/>
+        </w:tabs>
+        <w:ind w:left="5760" w:hanging="360"/>
+      </w:pPr>
+      <w:rPr>
+        <w:rFonts w:ascii="Wingdings" w:hAnsi="Wingdings" w:hint="default"/>
+        <w:sz w:val="20"/>
+      </w:rPr>
+    </w:lvl>
+    <w:lvl w:ilvl="8" w:tentative="1">
+      <w:start w:val="1"/>
+      <w:numFmt w:val="bullet"/>
+      <w:lvlText w:val=""/>
+      <w:lvlJc w:val="left"/>
+      <w:pPr>
+        <w:tabs>
+          <w:tab w:val="num" w:pos="6480"/>
+        </w:tabs>
+        <w:ind w:left="6480" w:hanging="360"/>
+      </w:pPr>
+      <w:rPr>
+        <w:rFonts w:ascii="Wingdings" w:hAnsi="Wingdings" w:hint="default"/>
+        <w:sz w:val="20"/>
+      </w:rPr>
+    </w:lvl>
+  </w:abstractNum>
   <w:num w:numId="1" w16cid:durableId="1134323791">
+    <w:abstractNumId w:val="10"/>
+  </w:num>
+  <w:num w:numId="2" w16cid:durableId="1454405026">
     <w:abstractNumId w:val="6"/>
   </w:num>
-  <w:num w:numId="2" w16cid:durableId="1454405026">
-    <w:abstractNumId w:val="3"/>
-  </w:num>
   <w:num w:numId="3" w16cid:durableId="949046978">
-    <w:abstractNumId w:val="1"/>
+    <w:abstractNumId w:val="2"/>
   </w:num>
   <w:num w:numId="4" w16cid:durableId="296567713">
+    <w:abstractNumId w:val="8"/>
+  </w:num>
+  <w:num w:numId="5" w16cid:durableId="82533269">
     <w:abstractNumId w:val="5"/>
   </w:num>
-  <w:num w:numId="5" w16cid:durableId="82533269">
-    <w:abstractNumId w:val="2"/>
-  </w:num>
   <w:num w:numId="6" w16cid:durableId="160708272">
-    <w:abstractNumId w:val="4"/>
+    <w:abstractNumId w:val="7"/>
   </w:num>
   <w:num w:numId="7" w16cid:durableId="205872805">
-    <w:abstractNumId w:val="8"/>
+    <w:abstractNumId w:val="12"/>
   </w:num>
   <w:num w:numId="8" w16cid:durableId="1922791794">
-    <w:abstractNumId w:val="7"/>
+    <w:abstractNumId w:val="11"/>
   </w:num>
   <w:num w:numId="9" w16cid:durableId="62724407">
     <w:abstractNumId w:val="0"/>
+  </w:num>
+  <w:num w:numId="10" w16cid:durableId="257837181">
+    <w:abstractNumId w:val="9"/>
+  </w:num>
+  <w:num w:numId="11" w16cid:durableId="688413623">
+    <w:abstractNumId w:val="1"/>
+  </w:num>
+  <w:num w:numId="12" w16cid:durableId="2134708095">
+    <w:abstractNumId w:val="4"/>
+  </w:num>
+  <w:num w:numId="13" w16cid:durableId="182060339">
+    <w:abstractNumId w:val="13"/>
+  </w:num>
+  <w:num w:numId="14" w16cid:durableId="1557472574">
+    <w:abstractNumId w:val="3"/>
   </w:num>
 </w:numbering>
 </file>
@@ -4870,7 +6383,6 @@
   <w:style w:type="character" w:default="1" w:styleId="DefaultParagraphFont">
     <w:name w:val="Default Paragraph Font"/>
     <w:uiPriority w:val="1"/>
-    <w:semiHidden/>
     <w:unhideWhenUsed/>
   </w:style>
   <w:style w:type="table" w:default="1" w:styleId="TableNormal">

</xml_diff>